<commit_message>
docs: update PM plan with Sprint 3 scope, Share Invitations WBS, and revised Jira tickets (MAG-12 to MAG-15)
</commit_message>
<xml_diff>
--- a/docs/Project_Management_Plan.docx
+++ b/docs/Project_Management_Plan.docx
@@ -2,84 +2,52 @@
 <file path=word/document.xml><?xml version="1.0" encoding="utf-8"?>
 <w:document xmlns:wpc="http://schemas.microsoft.com/office/word/2010/wordprocessingCanvas" xmlns:mo="http://schemas.microsoft.com/office/mac/office/2008/main" xmlns:mc="http://schemas.openxmlformats.org/markup-compatibility/2006" xmlns:mv="urn:schemas-microsoft-com:mac:vml" xmlns:o="urn:schemas-microsoft-com:office:office" xmlns:r="http://schemas.openxmlformats.org/officeDocument/2006/relationships" xmlns:m="http://schemas.openxmlformats.org/officeDocument/2006/math" xmlns:v="urn:schemas-microsoft-com:vml" xmlns:wp14="http://schemas.microsoft.com/office/word/2010/wordprocessingDrawing" xmlns:wp="http://schemas.openxmlformats.org/drawingml/2006/wordprocessingDrawing" xmlns:w10="urn:schemas-microsoft-com:office:word" xmlns:w="http://schemas.openxmlformats.org/wordprocessingml/2006/main" xmlns:w14="http://schemas.microsoft.com/office/word/2010/wordml" xmlns:wpg="http://schemas.microsoft.com/office/word/2010/wordprocessingGroup" xmlns:wpi="http://schemas.microsoft.com/office/word/2010/wordprocessingInk" xmlns:wne="http://schemas.microsoft.com/office/word/2006/wordml" xmlns:wps="http://schemas.microsoft.com/office/word/2010/wordprocessingShape" mc:Ignorable="w14 wp14">
   <w:body>
-    <w:p/>
-    <w:p/>
     <w:p>
       <w:pPr>
-        <w:jc w:val="center"/>
+        <w:pStyle w:val="Heading1"/>
       </w:pPr>
       <w:r>
         <w:rPr>
+          <w:color w:val="1A1A1A"/>
+        </w:rPr>
+        <w:t>MagulaPlan — Project Management Plan</w:t>
+      </w:r>
+    </w:p>
+    <w:p>
+      <w:r>
+        <w:rPr>
           <w:b/>
-          <w:color w:val="2F5496"/>
-          <w:sz w:val="56"/>
+          <w:i w:val="0"/>
         </w:rPr>
-        <w:t>MagulaPlan</w:t>
+        <w:t xml:space="preserve">Module: Project Management  </w:t>
+      </w:r>
+    </w:p>
+    <w:p>
+      <w:r>
+        <w:rPr>
+          <w:b/>
+          <w:i w:val="0"/>
+        </w:rPr>
+        <w:t xml:space="preserve">Team: Group 04  </w:t>
+      </w:r>
+    </w:p>
+    <w:p>
+      <w:r>
+        <w:rPr>
+          <w:b/>
+          <w:i w:val="0"/>
+        </w:rPr>
+        <w:t xml:space="preserve">Date: August 2026  </w:t>
+      </w:r>
+    </w:p>
+    <w:p>
+      <w:r>
+        <w:t>────────────────────────────────────────────────────────────</w:t>
       </w:r>
     </w:p>
     <w:p>
       <w:pPr>
-        <w:jc w:val="center"/>
-      </w:pPr>
-      <w:r>
-        <w:rPr>
-          <w:color w:val="2F5496"/>
-          <w:sz w:val="36"/>
-        </w:rPr>
-        <w:t>Project Management Plan</w:t>
-      </w:r>
-    </w:p>
-    <w:p/>
-    <w:p>
-      <w:pPr>
-        <w:jc w:val="center"/>
-      </w:pPr>
-      <w:r>
-        <w:rPr>
-          <w:b/>
-        </w:rPr>
-        <w:t>Module:</w:t>
-      </w:r>
-      <w:r>
-        <w:t xml:space="preserve"> Project Management</w:t>
-      </w:r>
-    </w:p>
-    <w:p>
-      <w:pPr>
-        <w:jc w:val="center"/>
-      </w:pPr>
-      <w:r>
-        <w:rPr>
-          <w:b/>
-        </w:rPr>
-        <w:t>Team:</w:t>
-      </w:r>
-      <w:r>
-        <w:t xml:space="preserve"> Group 04</w:t>
-      </w:r>
-    </w:p>
-    <w:p>
-      <w:pPr>
-        <w:jc w:val="center"/>
-      </w:pPr>
-      <w:r>
-        <w:rPr>
-          <w:b/>
-        </w:rPr>
-        <w:t>Date:</w:t>
-      </w:r>
-      <w:r>
-        <w:t xml:space="preserve"> August 2026</w:t>
-      </w:r>
-    </w:p>
-    <w:p>
-      <w:r>
-        <w:br w:type="page"/>
-      </w:r>
-    </w:p>
-    <w:p>
-      <w:pPr>
-        <w:pStyle w:val="Heading1"/>
+        <w:pStyle w:val="Heading2"/>
       </w:pPr>
       <w:r>
         <w:rPr>
@@ -90,7 +58,7 @@
     </w:p>
     <w:p>
       <w:pPr>
-        <w:pStyle w:val="Heading2"/>
+        <w:pStyle w:val="Heading3"/>
       </w:pPr>
       <w:r>
         <w:rPr>
@@ -110,7 +78,7 @@
     </w:p>
     <w:p>
       <w:pPr>
-        <w:pStyle w:val="Heading2"/>
+        <w:pStyle w:val="Heading3"/>
       </w:pPr>
       <w:r>
         <w:rPr>
@@ -130,7 +98,7 @@
     </w:p>
     <w:p>
       <w:pPr>
-        <w:pStyle w:val="Heading2"/>
+        <w:pStyle w:val="Heading3"/>
       </w:pPr>
       <w:r>
         <w:rPr>
@@ -149,8 +117,13 @@
       </w:r>
     </w:p>
     <w:p>
+      <w:r>
+        <w:t>────────────────────────────────────────────────────────────</w:t>
+      </w:r>
+    </w:p>
+    <w:p>
       <w:pPr>
-        <w:pStyle w:val="Heading1"/>
+        <w:pStyle w:val="Heading2"/>
       </w:pPr>
       <w:r>
         <w:rPr>
@@ -170,7 +143,7 @@
     </w:p>
     <w:p>
       <w:pPr>
-        <w:pStyle w:val="Heading2"/>
+        <w:pStyle w:val="Heading3"/>
       </w:pPr>
       <w:r>
         <w:rPr>
@@ -315,7 +288,7 @@
               <w:rPr>
                 <w:sz w:val="16"/>
               </w:rPr>
-              <w:t>Sprint planning, timeline management, stakeholder communication, documentation compilation, WhatsApp Business API integration (MAG-11)</w:t>
+              <w:t>Sprint planning, timeline management, stakeholder communication, documentation compilation, Share Invitations implementation (MAG-11)</w:t>
             </w:r>
           </w:p>
         </w:tc>
@@ -382,7 +355,7 @@
     <w:p/>
     <w:p>
       <w:pPr>
-        <w:pStyle w:val="Heading2"/>
+        <w:pStyle w:val="Heading3"/>
       </w:pPr>
       <w:r>
         <w:rPr>
@@ -536,7 +509,7 @@
     <w:p/>
     <w:p>
       <w:pPr>
-        <w:pStyle w:val="Heading2"/>
+        <w:pStyle w:val="Heading3"/>
       </w:pPr>
       <w:r>
         <w:rPr>
@@ -747,8 +720,13 @@
     </w:tbl>
     <w:p/>
     <w:p>
+      <w:r>
+        <w:t>────────────────────────────────────────────────────────────</w:t>
+      </w:r>
+    </w:p>
+    <w:p>
       <w:pPr>
-        <w:pStyle w:val="Heading1"/>
+        <w:pStyle w:val="Heading2"/>
       </w:pPr>
       <w:r>
         <w:rPr>
@@ -768,7 +746,7 @@
     </w:p>
     <w:p>
       <w:pPr>
-        <w:pStyle w:val="Heading2"/>
+        <w:pStyle w:val="Heading3"/>
       </w:pPr>
       <w:r>
         <w:rPr>
@@ -780,8 +758,8 @@
     <w:p>
       <w:r>
         <w:rPr>
-          <w:b w:val="0"/>
-          <w:i/>
+          <w:b/>
+          <w:i w:val="0"/>
         </w:rPr>
         <w:t>Focus: System blueprints, UI design, and environment configuration.</w:t>
       </w:r>
@@ -792,7 +770,7 @@
           <w:b w:val="0"/>
           <w:i w:val="0"/>
         </w:rPr>
-        <w:t>The first sprint establishes the architectural foundation of the platform. The database engineer designs and finalizes the MySQL Entity-Relationship (ER) diagram, normalizing the schema to third normal form and documenting all table relationships, constraints, and indexing strategies. In parallel, the backend developer maps the complete set of REST API endpoints, defining HTTP methods, URI patterns, request/response JSON payloads, and status codes for the four core modules. The frontend developer produces low-fidelity wireframes for the Vendor Directory, Budget Tracker, and RSVP Dashboard, validating layout and user flow assumptions before high-fidelity implementation begins. The project manager initializes the GitHub monorepo with the agreed-upon directory structure, configures branch protection rules on the main branch, and sets up the Jira Kanban board for sprint tracking.</w:t>
+        <w:t>The first sprint establishes the architectural foundation of the platform. The database engineer designs and finalizes the MySQL Entity-Relationship (ER) diagram, normalizing the schema to third normal form and documenting all table relationships, constraints, and indexing strategies. In parallel, the backend developer maps the complete set of REST API endpoints, defining HTTP methods, URI patterns, request/response JSON payloads, and status codes for the four core modules. The frontend developer produces low-fidelity wireframes for the Vendor Directory, Budget Tracker, and RSVP Dashboard, validating layout and user flow assumptions before high-fidelity implementation begins. The project manager initializes the GitHub monorepo with the agreed-upon directory structure, configures branch protection rules on the `main` branch, and sets up the Jira Kanban board for sprint tracking.</w:t>
       </w:r>
     </w:p>
     <w:p>
@@ -846,7 +824,7 @@
     </w:p>
     <w:p>
       <w:pPr>
-        <w:pStyle w:val="Heading2"/>
+        <w:pStyle w:val="Heading3"/>
       </w:pPr>
       <w:r>
         <w:rPr>
@@ -858,8 +836,8 @@
     <w:p>
       <w:r>
         <w:rPr>
-          <w:b w:val="0"/>
-          <w:i/>
+          <w:b/>
+          <w:i w:val="0"/>
         </w:rPr>
         <w:t>Focus: Building the functional MVP, connecting the database, and WhatsApp API integration.</w:t>
       </w:r>
@@ -874,20 +852,11 @@
       </w:r>
     </w:p>
     <w:p>
-      <w:r>
-        <w:rPr>
-          <w:b/>
-          <w:i w:val="0"/>
-        </w:rPr>
-        <w:t>Deliverables:</w:t>
-      </w:r>
-    </w:p>
-    <w:p>
       <w:pPr>
         <w:pStyle w:val="ListBullet"/>
       </w:pPr>
       <w:r>
-        <w:t>Executable MySQL schema script (schema.sql)</w:t>
+        <w:t>Executable MySQL schema script (`schema.sql`)</w:t>
       </w:r>
     </w:p>
     <w:p>
@@ -932,7 +901,7 @@
     </w:p>
     <w:p>
       <w:pPr>
-        <w:pStyle w:val="Heading2"/>
+        <w:pStyle w:val="Heading3"/>
       </w:pPr>
       <w:r>
         <w:rPr>
@@ -944,10 +913,10 @@
     <w:p>
       <w:r>
         <w:rPr>
-          <w:b w:val="0"/>
-          <w:i/>
+          <w:b/>
+          <w:i w:val="0"/>
         </w:rPr>
-        <w:t>Focus: Quality assurance, cloud deployment, and final documentation.</w:t>
+        <w:t>Focus: Unit testing, quality assurance, cloud deployment, and final documentation.</w:t>
       </w:r>
     </w:p>
     <w:p>
@@ -956,16 +925,15 @@
           <w:b w:val="0"/>
           <w:i w:val="0"/>
         </w:rPr>
-        <w:t>The final sprint delivers the completed MVP. The QA engineer executes the full system test plan, logging defects in a structured defect register with severity classifications and retesting resolved issues. The frontend is deployed to Vercel with environment-specific configuration, while the Spring Boot API and MySQL database are deployed to Render with connection string and secret management in place. The team compiles final project documentation, including the system design report, sprint review summaries, and the end-of-semester presentation slide deck.</w:t>
+        <w:t>The final sprint completes the MVP and prepares it for submission. Ruchira carries over MAG-10 (Automated JUnit Tests) from Sprint 2, writing unit and integration tests for the Guest, User, Budget, Vendor, and VendorCategory service layers using JUnit 5, Mockito, and an H2 in-memory database. In parallel, she executes the full system test plan, logging defects in a structured defect register with severity classifications and retesting resolved issues. Sammani deploys the React frontend to Vercel with environment-specific configuration and the Spring Boot API and MySQL database to Render with connection string and secret management in place. Dileepa polishes UI components, implements the Guest List page with Web Share API invitation buttons, and connects frontend forms to the live backend API endpoints. The project manager compiles the final project documentation, including the system design report, sprint review summaries, and the end-of-semester presentation slide deck.</w:t>
       </w:r>
     </w:p>
     <w:p>
+      <w:pPr>
+        <w:pStyle w:val="ListBullet"/>
+      </w:pPr>
       <w:r>
-        <w:rPr>
-          <w:b/>
-          <w:i w:val="0"/>
-        </w:rPr>
-        <w:t>Deliverables:</w:t>
+        <w:t>Automated JUnit test suite (Guest, User, Budget, Vendor, VendorCategory)</w:t>
       </w:r>
     </w:p>
     <w:p>
@@ -989,7 +957,7 @@
         <w:pStyle w:val="ListBullet"/>
       </w:pPr>
       <w:r>
-        <w:t>Final project documentation package</w:t>
+        <w:t>Guest List page with share invitation links</w:t>
       </w:r>
     </w:p>
     <w:p>
@@ -1002,7 +970,20 @@
     </w:p>
     <w:p>
       <w:pPr>
-        <w:pStyle w:val="Heading1"/>
+        <w:pStyle w:val="ListBullet"/>
+      </w:pPr>
+      <w:r>
+        <w:t>Final project documentation package</w:t>
+      </w:r>
+    </w:p>
+    <w:p>
+      <w:r>
+        <w:t>────────────────────────────────────────────────────────────</w:t>
+      </w:r>
+    </w:p>
+    <w:p>
+      <w:pPr>
+        <w:pStyle w:val="Heading2"/>
       </w:pPr>
       <w:r>
         <w:rPr>
@@ -1030,13 +1011,12 @@
           <w:color w:val="555555"/>
           <w:sz w:val="20"/>
         </w:rPr>
-        <w:t>WBS ID Convention: WBS task IDs (e.g., VD-01, BT-03) are planning-level decomposition codes used in this document for traceability. The Jira Story column indicates the parent Jira user story (e.g., MAG-1) under which each sub-task is tracked on the Kanban board. A single Jira story typically encompasses multiple WBS tasks spanning design, implementation, and testing.</w:t>
+        <w:t>**WBS ID Convention:** WBS task IDs (e.g., `VD-01`, `BT-03`) are planning-level decomposition codes used in this document for traceability. The **Jira Story** column indicates the parent Jira user story (e.g., `MAG-1`) under which each sub-task is tracked on the Kanban board. A single Jira story typically encompasses multiple WBS tasks spanning design, implementation, and testing.</w:t>
       </w:r>
     </w:p>
-    <w:p/>
     <w:p>
       <w:pPr>
-        <w:pStyle w:val="Heading2"/>
+        <w:pStyle w:val="Heading3"/>
       </w:pPr>
       <w:r>
         <w:rPr>
@@ -1141,7 +1121,7 @@
                 <w:color w:val="FFFFFF"/>
                 <w:sz w:val="16"/>
               </w:rPr>
-              <w:t>Est. Effort</w:t>
+              <w:t>Estimated Effort</w:t>
             </w:r>
           </w:p>
         </w:tc>
@@ -1171,7 +1151,7 @@
               <w:rPr>
                 <w:sz w:val="16"/>
               </w:rPr>
-              <w:t>Design and normalize vendors and vendor_categories tables in ER diagram</w:t>
+              <w:t>Design and normalize `vendors` and `vendor_categories` tables in ER diagram</w:t>
             </w:r>
           </w:p>
         </w:tc>
@@ -1213,7 +1193,7 @@
               <w:rPr>
                 <w:sz w:val="16"/>
               </w:rPr>
-              <w:t>4 hrs</w:t>
+              <w:t>4 hours</w:t>
             </w:r>
           </w:p>
         </w:tc>
@@ -1243,7 +1223,7 @@
               <w:rPr>
                 <w:sz w:val="16"/>
               </w:rPr>
-              <w:t>Write SQL DDL for vendors and vendor_categories tables with FK constraints</w:t>
+              <w:t>Write SQL DDL for `vendors` and `vendor_categories` tables with FK constraints</w:t>
             </w:r>
           </w:p>
         </w:tc>
@@ -1285,7 +1265,7 @@
               <w:rPr>
                 <w:sz w:val="16"/>
               </w:rPr>
-              <w:t>2 hrs</w:t>
+              <w:t>2 hours</w:t>
             </w:r>
           </w:p>
         </w:tc>
@@ -1315,7 +1295,7 @@
               <w:rPr>
                 <w:sz w:val="16"/>
               </w:rPr>
-              <w:t>Implement Vendor and VendorCategory JPA entity classes with Lombok</w:t>
+              <w:t>Implement `Vendor` and `VendorCategory` JPA entity classes with Lombok</w:t>
             </w:r>
           </w:p>
         </w:tc>
@@ -1357,7 +1337,7 @@
               <w:rPr>
                 <w:sz w:val="16"/>
               </w:rPr>
-              <w:t>3 hrs</w:t>
+              <w:t>3 hours</w:t>
             </w:r>
           </w:p>
         </w:tc>
@@ -1387,7 +1367,7 @@
               <w:rPr>
                 <w:sz w:val="16"/>
               </w:rPr>
-              <w:t>Implement VendorRepository with custom query methods</w:t>
+              <w:t>Implement `VendorRepository` with custom query methods (filter by category, district, price range)</w:t>
             </w:r>
           </w:p>
         </w:tc>
@@ -1429,7 +1409,7 @@
               <w:rPr>
                 <w:sz w:val="16"/>
               </w:rPr>
-              <w:t>2 hrs</w:t>
+              <w:t>2 hours</w:t>
             </w:r>
           </w:p>
         </w:tc>
@@ -1459,7 +1439,7 @@
               <w:rPr>
                 <w:sz w:val="16"/>
               </w:rPr>
-              <w:t>Implement VendorService with search, filter, and pagination logic</w:t>
+              <w:t>Implement `VendorService` with business logic for search, filter, and pagination</w:t>
             </w:r>
           </w:p>
         </w:tc>
@@ -1501,7 +1481,7 @@
               <w:rPr>
                 <w:sz w:val="16"/>
               </w:rPr>
-              <w:t>5 hrs</w:t>
+              <w:t>5 hours</w:t>
             </w:r>
           </w:p>
         </w:tc>
@@ -1531,7 +1511,7 @@
               <w:rPr>
                 <w:sz w:val="16"/>
               </w:rPr>
-              <w:t>Implement VendorController REST endpoints (CRUD + search/filter)</w:t>
+              <w:t>Implement `VendorController` REST endpoints (GET all, GET by ID, GET filtered, POST, PUT, DELETE)</w:t>
             </w:r>
           </w:p>
         </w:tc>
@@ -1573,7 +1553,7 @@
               <w:rPr>
                 <w:sz w:val="16"/>
               </w:rPr>
-              <w:t>4 hrs</w:t>
+              <w:t>4 hours</w:t>
             </w:r>
           </w:p>
         </w:tc>
@@ -1603,7 +1583,7 @@
               <w:rPr>
                 <w:sz w:val="16"/>
               </w:rPr>
-              <w:t>Design Vendor Directory page layout with search bar and filters</w:t>
+              <w:t>Design Vendor Directory page layout with search bar, category filters, and location dropdown</w:t>
             </w:r>
           </w:p>
         </w:tc>
@@ -1645,7 +1625,7 @@
               <w:rPr>
                 <w:sz w:val="16"/>
               </w:rPr>
-              <w:t>4 hrs</w:t>
+              <w:t>4 hours</w:t>
             </w:r>
           </w:p>
         </w:tc>
@@ -1675,7 +1655,7 @@
               <w:rPr>
                 <w:sz w:val="16"/>
               </w:rPr>
-              <w:t>Implement Vendor Card React component</w:t>
+              <w:t>Implement Vendor Card React component with business name, category, district, starting price</w:t>
             </w:r>
           </w:p>
         </w:tc>
@@ -1717,7 +1697,7 @@
               <w:rPr>
                 <w:sz w:val="16"/>
               </w:rPr>
-              <w:t>5 hrs</w:t>
+              <w:t>5 hours</w:t>
             </w:r>
           </w:p>
         </w:tc>
@@ -1747,7 +1727,7 @@
               <w:rPr>
                 <w:sz w:val="16"/>
               </w:rPr>
-              <w:t>Implement Vendor Directory page with filter state and API integration</w:t>
+              <w:t>Implement Vendor Directory page with filter state management and API integration</w:t>
             </w:r>
           </w:p>
         </w:tc>
@@ -1789,7 +1769,7 @@
               <w:rPr>
                 <w:sz w:val="16"/>
               </w:rPr>
-              <w:t>6 hrs</w:t>
+              <w:t>6 hours</w:t>
             </w:r>
           </w:p>
         </w:tc>
@@ -1819,7 +1799,7 @@
               <w:rPr>
                 <w:sz w:val="16"/>
               </w:rPr>
-              <w:t>Implement Vendor Detail page</w:t>
+              <w:t>Implement Vendor Detail page with full information display</w:t>
             </w:r>
           </w:p>
         </w:tc>
@@ -1861,7 +1841,7 @@
               <w:rPr>
                 <w:sz w:val="16"/>
               </w:rPr>
-              <w:t>4 hrs</w:t>
+              <w:t>4 hours</w:t>
             </w:r>
           </w:p>
         </w:tc>
@@ -1891,7 +1871,7 @@
               <w:rPr>
                 <w:sz w:val="16"/>
               </w:rPr>
-              <w:t>Style all Vendor components with Tailwind CSS (responsive)</w:t>
+              <w:t>Style all Vendor components with Tailwind CSS (responsive: mobile, tablet, desktop)</w:t>
             </w:r>
           </w:p>
         </w:tc>
@@ -1933,7 +1913,7 @@
               <w:rPr>
                 <w:sz w:val="16"/>
               </w:rPr>
-              <w:t>3 hrs</w:t>
+              <w:t>3 hours</w:t>
             </w:r>
           </w:p>
         </w:tc>
@@ -2005,7 +1985,7 @@
               <w:rPr>
                 <w:sz w:val="16"/>
               </w:rPr>
-              <w:t>3 hrs</w:t>
+              <w:t>3 hours</w:t>
             </w:r>
           </w:p>
         </w:tc>
@@ -2077,7 +2057,7 @@
               <w:rPr>
                 <w:sz w:val="16"/>
               </w:rPr>
-              <w:t>3 hrs</w:t>
+              <w:t>3 hours</w:t>
             </w:r>
           </w:p>
         </w:tc>
@@ -2086,7 +2066,7 @@
     <w:p/>
     <w:p>
       <w:pPr>
-        <w:pStyle w:val="Heading2"/>
+        <w:pStyle w:val="Heading3"/>
       </w:pPr>
       <w:r>
         <w:rPr>
@@ -2191,7 +2171,7 @@
                 <w:color w:val="FFFFFF"/>
                 <w:sz w:val="16"/>
               </w:rPr>
-              <w:t>Est. Effort</w:t>
+              <w:t>Estimated Effort</w:t>
             </w:r>
           </w:p>
         </w:tc>
@@ -2221,7 +2201,7 @@
               <w:rPr>
                 <w:sz w:val="16"/>
               </w:rPr>
-              <w:t>Design and normalize budget_items table in ER diagram</w:t>
+              <w:t>Design and normalize `budget_items` table in ER diagram</w:t>
             </w:r>
           </w:p>
         </w:tc>
@@ -2263,7 +2243,7 @@
               <w:rPr>
                 <w:sz w:val="16"/>
               </w:rPr>
-              <w:t>2 hrs</w:t>
+              <w:t>2 hours</w:t>
             </w:r>
           </w:p>
         </w:tc>
@@ -2293,7 +2273,7 @@
               <w:rPr>
                 <w:sz w:val="16"/>
               </w:rPr>
-              <w:t>Write SQL DDL for budget_items table with FK to users</w:t>
+              <w:t>Write SQL DDL for `budget_items` table with FK to `users`</w:t>
             </w:r>
           </w:p>
         </w:tc>
@@ -2335,7 +2315,7 @@
               <w:rPr>
                 <w:sz w:val="16"/>
               </w:rPr>
-              <w:t>2 hrs</w:t>
+              <w:t>2 hours</w:t>
             </w:r>
           </w:p>
         </w:tc>
@@ -2365,7 +2345,7 @@
               <w:rPr>
                 <w:sz w:val="16"/>
               </w:rPr>
-              <w:t>Implement BudgetItem JPA entity class with Lombok</w:t>
+              <w:t>Implement `BudgetItem` JPA entity class with Lombok</w:t>
             </w:r>
           </w:p>
         </w:tc>
@@ -2407,7 +2387,7 @@
               <w:rPr>
                 <w:sz w:val="16"/>
               </w:rPr>
-              <w:t>2 hrs</w:t>
+              <w:t>2 hours</w:t>
             </w:r>
           </w:p>
         </w:tc>
@@ -2437,7 +2417,7 @@
               <w:rPr>
                 <w:sz w:val="16"/>
               </w:rPr>
-              <w:t>Implement BudgetItemRepository with custom queries</w:t>
+              <w:t>Implement `BudgetItemRepository` with custom queries (sum by category, filter by status)</w:t>
             </w:r>
           </w:p>
         </w:tc>
@@ -2479,7 +2459,7 @@
               <w:rPr>
                 <w:sz w:val="16"/>
               </w:rPr>
-              <w:t>2 hrs</w:t>
+              <w:t>2 hours</w:t>
             </w:r>
           </w:p>
         </w:tc>
@@ -2509,7 +2489,7 @@
               <w:rPr>
                 <w:sz w:val="16"/>
               </w:rPr>
-              <w:t>Implement BudgetItemService with CRUD and budget summary aggregation</w:t>
+              <w:t>Implement `BudgetItemService` with CRUD and budget summary aggregation logic</w:t>
             </w:r>
           </w:p>
         </w:tc>
@@ -2551,7 +2531,7 @@
               <w:rPr>
                 <w:sz w:val="16"/>
               </w:rPr>
-              <w:t>5 hrs</w:t>
+              <w:t>5 hours</w:t>
             </w:r>
           </w:p>
         </w:tc>
@@ -2581,7 +2561,7 @@
               <w:rPr>
                 <w:sz w:val="16"/>
               </w:rPr>
-              <w:t>Implement BudgetController REST endpoints (CRUD + summary)</w:t>
+              <w:t>Implement `BudgetController` REST endpoints (GET all, POST, PUT, DELETE, GET summary)</w:t>
             </w:r>
           </w:p>
         </w:tc>
@@ -2623,7 +2603,7 @@
               <w:rPr>
                 <w:sz w:val="16"/>
               </w:rPr>
-              <w:t>3 hrs</w:t>
+              <w:t>3 hours</w:t>
             </w:r>
           </w:p>
         </w:tc>
@@ -2653,7 +2633,7 @@
               <w:rPr>
                 <w:sz w:val="16"/>
               </w:rPr>
-              <w:t>Design Budget Tracker dashboard layout with summary cards</w:t>
+              <w:t>Design Budget Tracker dashboard layout with summary cards and item list</w:t>
             </w:r>
           </w:p>
         </w:tc>
@@ -2695,7 +2675,7 @@
               <w:rPr>
                 <w:sz w:val="16"/>
               </w:rPr>
-              <w:t>4 hrs</w:t>
+              <w:t>4 hours</w:t>
             </w:r>
           </w:p>
         </w:tc>
@@ -2725,7 +2705,7 @@
               <w:rPr>
                 <w:sz w:val="16"/>
               </w:rPr>
-              <w:t>Implement Budget Summary cards with progress visualization</w:t>
+              <w:t>Implement Budget Summary cards (total budget, spent, remaining) with progress visualization</w:t>
             </w:r>
           </w:p>
         </w:tc>
@@ -2767,7 +2747,7 @@
               <w:rPr>
                 <w:sz w:val="16"/>
               </w:rPr>
-              <w:t>5 hrs</w:t>
+              <w:t>5 hours</w:t>
             </w:r>
           </w:p>
         </w:tc>
@@ -2797,7 +2777,7 @@
               <w:rPr>
                 <w:sz w:val="16"/>
               </w:rPr>
-              <w:t>Implement Budget Item form (add/edit modal)</w:t>
+              <w:t>Implement Budget Item form (add/edit modal) with category selection and cost fields</w:t>
             </w:r>
           </w:p>
         </w:tc>
@@ -2839,7 +2819,7 @@
               <w:rPr>
                 <w:sz w:val="16"/>
               </w:rPr>
-              <w:t>5 hrs</w:t>
+              <w:t>5 hours</w:t>
             </w:r>
           </w:p>
         </w:tc>
@@ -2869,7 +2849,7 @@
               <w:rPr>
                 <w:sz w:val="16"/>
               </w:rPr>
-              <w:t>Implement Budget Item list with status badges</w:t>
+              <w:t>Implement Budget Item list with status badges and inline edit controls</w:t>
             </w:r>
           </w:p>
         </w:tc>
@@ -2911,7 +2891,7 @@
               <w:rPr>
                 <w:sz w:val="16"/>
               </w:rPr>
-              <w:t>4 hrs</w:t>
+              <w:t>4 hours</w:t>
             </w:r>
           </w:p>
         </w:tc>
@@ -2983,7 +2963,7 @@
               <w:rPr>
                 <w:sz w:val="16"/>
               </w:rPr>
-              <w:t>3 hrs</w:t>
+              <w:t>3 hours</w:t>
             </w:r>
           </w:p>
         </w:tc>
@@ -3013,7 +2993,7 @@
               <w:rPr>
                 <w:sz w:val="16"/>
               </w:rPr>
-              <w:t>Write unit tests for BudgetItemService and integration tests</w:t>
+              <w:t>Write unit tests for BudgetItemService and integration tests for BudgetController</w:t>
             </w:r>
           </w:p>
         </w:tc>
@@ -3055,7 +3035,7 @@
               <w:rPr>
                 <w:sz w:val="16"/>
               </w:rPr>
-              <w:t>2 hrs</w:t>
+              <w:t>2 hours</w:t>
             </w:r>
           </w:p>
         </w:tc>
@@ -3127,7 +3107,7 @@
               <w:rPr>
                 <w:sz w:val="16"/>
               </w:rPr>
-              <w:t>2 hrs</w:t>
+              <w:t>2 hours</w:t>
             </w:r>
           </w:p>
         </w:tc>
@@ -3136,7 +3116,7 @@
     <w:p/>
     <w:p>
       <w:pPr>
-        <w:pStyle w:val="Heading2"/>
+        <w:pStyle w:val="Heading3"/>
       </w:pPr>
       <w:r>
         <w:rPr>
@@ -3241,7 +3221,7 @@
                 <w:color w:val="FFFFFF"/>
                 <w:sz w:val="16"/>
               </w:rPr>
-              <w:t>Est. Effort</w:t>
+              <w:t>Estimated Effort</w:t>
             </w:r>
           </w:p>
         </w:tc>
@@ -3271,7 +3251,7 @@
               <w:rPr>
                 <w:sz w:val="16"/>
               </w:rPr>
-              <w:t>Design and normalize guests table with UUID PK in ER diagram</w:t>
+              <w:t>Design and normalize `guests` table with UUID primary key in ER diagram</w:t>
             </w:r>
           </w:p>
         </w:tc>
@@ -3313,7 +3293,7 @@
               <w:rPr>
                 <w:sz w:val="16"/>
               </w:rPr>
-              <w:t>3 hrs</w:t>
+              <w:t>3 hours</w:t>
             </w:r>
           </w:p>
         </w:tc>
@@ -3343,7 +3323,7 @@
               <w:rPr>
                 <w:sz w:val="16"/>
               </w:rPr>
-              <w:t>Write SQL DDL for guests table with FK to users</w:t>
+              <w:t>Write SQL DDL for `guests` table with FK to `users` and ENUM/VARCHAR defaults</w:t>
             </w:r>
           </w:p>
         </w:tc>
@@ -3385,7 +3365,7 @@
               <w:rPr>
                 <w:sz w:val="16"/>
               </w:rPr>
-              <w:t>2 hrs</w:t>
+              <w:t>2 hours</w:t>
             </w:r>
           </w:p>
         </w:tc>
@@ -3415,7 +3395,7 @@
               <w:rPr>
                 <w:sz w:val="16"/>
               </w:rPr>
-              <w:t>Implement Guest JPA entity class with UUID generation strategy</w:t>
+              <w:t>Implement `Guest` JPA entity class with UUID generation strategy</w:t>
             </w:r>
           </w:p>
         </w:tc>
@@ -3457,7 +3437,7 @@
               <w:rPr>
                 <w:sz w:val="16"/>
               </w:rPr>
-              <w:t>2 hrs</w:t>
+              <w:t>2 hours</w:t>
             </w:r>
           </w:p>
         </w:tc>
@@ -3487,7 +3467,7 @@
               <w:rPr>
                 <w:sz w:val="16"/>
               </w:rPr>
-              <w:t>Implement GuestRepository with custom queries</w:t>
+              <w:t>Implement `GuestRepository` with custom queries (find by user, filter by RSVP status, filter by side)</w:t>
             </w:r>
           </w:p>
         </w:tc>
@@ -3529,7 +3509,7 @@
               <w:rPr>
                 <w:sz w:val="16"/>
               </w:rPr>
-              <w:t>2 hrs</w:t>
+              <w:t>2 hours</w:t>
             </w:r>
           </w:p>
         </w:tc>
@@ -3559,7 +3539,7 @@
               <w:rPr>
                 <w:sz w:val="16"/>
               </w:rPr>
-              <w:t>Implement GuestService with CRUD and status tracking</w:t>
+              <w:t>Implement `GuestService` with CRUD, RSVP status update, and WhatsApp status tracking</w:t>
             </w:r>
           </w:p>
         </w:tc>
@@ -3601,7 +3581,7 @@
               <w:rPr>
                 <w:sz w:val="16"/>
               </w:rPr>
-              <w:t>5 hrs</w:t>
+              <w:t>5 hours</w:t>
             </w:r>
           </w:p>
         </w:tc>
@@ -3631,7 +3611,7 @@
               <w:rPr>
                 <w:sz w:val="16"/>
               </w:rPr>
-              <w:t>Implement GuestController REST endpoints (CRUD + RSVP status update)</w:t>
+              <w:t>Implement `GuestController` REST endpoints (GET all, GET by ID, POST, PUT, DELETE, PATCH RSVP status)</w:t>
             </w:r>
           </w:p>
         </w:tc>
@@ -3673,7 +3653,7 @@
               <w:rPr>
                 <w:sz w:val="16"/>
               </w:rPr>
-              <w:t>4 hrs</w:t>
+              <w:t>4 hours</w:t>
             </w:r>
           </w:p>
         </w:tc>
@@ -3703,7 +3683,7 @@
               <w:rPr>
                 <w:sz w:val="16"/>
               </w:rPr>
-              <w:t>Design Guest List dashboard layout</w:t>
+              <w:t>Design Guest List dashboard layout with summary stats and guest table</w:t>
             </w:r>
           </w:p>
         </w:tc>
@@ -3745,7 +3725,7 @@
               <w:rPr>
                 <w:sz w:val="16"/>
               </w:rPr>
-              <w:t>4 hrs</w:t>
+              <w:t>4 hours</w:t>
             </w:r>
           </w:p>
         </w:tc>
@@ -3775,7 +3755,7 @@
               <w:rPr>
                 <w:sz w:val="16"/>
               </w:rPr>
-              <w:t>Implement Guest table with sortable columns and status badges</w:t>
+              <w:t>Implement Guest table with sortable columns, RSVP status badges, and side-of-family indicators</w:t>
             </w:r>
           </w:p>
         </w:tc>
@@ -3817,7 +3797,7 @@
               <w:rPr>
                 <w:sz w:val="16"/>
               </w:rPr>
-              <w:t>5 hrs</w:t>
+              <w:t>5 hours</w:t>
             </w:r>
           </w:p>
         </w:tc>
@@ -3847,7 +3827,7 @@
               <w:rPr>
                 <w:sz w:val="16"/>
               </w:rPr>
-              <w:t>Implement Add/Edit Guest modal</w:t>
+              <w:t>Implement Add/Edit Guest modal with side-of-family, plus-ones, and meal preference fields</w:t>
             </w:r>
           </w:p>
         </w:tc>
@@ -3889,7 +3869,7 @@
               <w:rPr>
                 <w:sz w:val="16"/>
               </w:rPr>
-              <w:t>5 hrs</w:t>
+              <w:t>5 hours</w:t>
             </w:r>
           </w:p>
         </w:tc>
@@ -3961,7 +3941,7 @@
               <w:rPr>
                 <w:sz w:val="16"/>
               </w:rPr>
-              <w:t>4 hrs</w:t>
+              <w:t>4 hours</w:t>
             </w:r>
           </w:p>
         </w:tc>
@@ -4033,7 +4013,7 @@
               <w:rPr>
                 <w:sz w:val="16"/>
               </w:rPr>
-              <w:t>3 hrs</w:t>
+              <w:t>3 hours</w:t>
             </w:r>
           </w:p>
         </w:tc>
@@ -4063,7 +4043,7 @@
               <w:rPr>
                 <w:sz w:val="16"/>
               </w:rPr>
-              <w:t>Write unit tests for GuestService and integration tests</w:t>
+              <w:t>Write unit tests for GuestService and integration tests for GuestController</w:t>
             </w:r>
           </w:p>
         </w:tc>
@@ -4105,7 +4085,7 @@
               <w:rPr>
                 <w:sz w:val="16"/>
               </w:rPr>
-              <w:t>3 hrs</w:t>
+              <w:t>3 hours</w:t>
             </w:r>
           </w:p>
         </w:tc>
@@ -4135,7 +4115,7 @@
               <w:rPr>
                 <w:sz w:val="16"/>
               </w:rPr>
-              <w:t>Execute UI tests on Guest List across device breakpoints</w:t>
+              <w:t>Execute UI tests on Guest List and RSVP Manager across device breakpoints</w:t>
             </w:r>
           </w:p>
         </w:tc>
@@ -4177,7 +4157,7 @@
               <w:rPr>
                 <w:sz w:val="16"/>
               </w:rPr>
-              <w:t>3 hrs</w:t>
+              <w:t>3 hours</w:t>
             </w:r>
           </w:p>
         </w:tc>
@@ -4186,13 +4166,13 @@
     <w:p/>
     <w:p>
       <w:pPr>
-        <w:pStyle w:val="Heading2"/>
+        <w:pStyle w:val="Heading3"/>
       </w:pPr>
       <w:r>
         <w:rPr>
           <w:color w:val="1A1A1A"/>
         </w:rPr>
-        <w:t>4.4 WhatsApp Invitation Integration Module</w:t>
+        <w:t>4.4 Share Invitations Module</w:t>
       </w:r>
     </w:p>
     <w:tbl>
@@ -4291,7 +4271,7 @@
                 <w:color w:val="FFFFFF"/>
                 <w:sz w:val="16"/>
               </w:rPr>
-              <w:t>Est. Effort</w:t>
+              <w:t>Estimated Effort</w:t>
             </w:r>
           </w:p>
         </w:tc>
@@ -4321,7 +4301,7 @@
               <w:rPr>
                 <w:sz w:val="16"/>
               </w:rPr>
-              <w:t>Register Meta Developer account and create WhatsApp Business App</w:t>
+              <w:t>Generate shareable RSVP link per guest (UUID-based URL)</w:t>
             </w:r>
           </w:p>
         </w:tc>
@@ -4363,7 +4343,7 @@
               <w:rPr>
                 <w:sz w:val="16"/>
               </w:rPr>
-              <w:t>3 hrs</w:t>
+              <w:t>1 hour</w:t>
             </w:r>
           </w:p>
         </w:tc>
@@ -4393,7 +4373,7 @@
               <w:rPr>
                 <w:sz w:val="16"/>
               </w:rPr>
-              <w:t>Configure WhatsApp Cloud API webhook endpoint and verify callback URL</w:t>
+              <w:t>Implement `GET /api/v1/guests/{guestId}/share` endpoint with invitation message and RSVP URL</w:t>
             </w:r>
           </w:p>
         </w:tc>
@@ -4435,7 +4415,7 @@
               <w:rPr>
                 <w:sz w:val="16"/>
               </w:rPr>
-              <w:t>4 hrs</w:t>
+              <w:t>2 hours</w:t>
             </w:r>
           </w:p>
         </w:tc>
@@ -4465,7 +4445,7 @@
               <w:rPr>
                 <w:sz w:val="16"/>
               </w:rPr>
-              <w:t>Design invitation message template with dynamic placeholders</w:t>
+              <w:t>Update `GuestServiceImpl` to mark `whatsapp_status = SENT` when share link is generated</w:t>
             </w:r>
           </w:p>
         </w:tc>
@@ -4507,7 +4487,7 @@
               <w:rPr>
                 <w:sz w:val="16"/>
               </w:rPr>
-              <w:t>2 hrs</w:t>
+              <w:t>1 hour</w:t>
             </w:r>
           </w:p>
         </w:tc>
@@ -4537,7 +4517,7 @@
               <w:rPr>
                 <w:sz w:val="16"/>
               </w:rPr>
-              <w:t>Implement WhatsAppService with template rendering and Cloud API HTTP client</w:t>
+              <w:t>Implement Guest List page with guest table, RSVP badges, and stats</w:t>
             </w:r>
           </w:p>
         </w:tc>
@@ -4565,7 +4545,7 @@
               <w:rPr>
                 <w:sz w:val="16"/>
               </w:rPr>
-              <w:t>Maheen</w:t>
+              <w:t>Dileepa</w:t>
             </w:r>
           </w:p>
         </w:tc>
@@ -4579,7 +4559,7 @@
               <w:rPr>
                 <w:sz w:val="16"/>
               </w:rPr>
-              <w:t>6 hrs</w:t>
+              <w:t>4 hours</w:t>
             </w:r>
           </w:p>
         </w:tc>
@@ -4609,7 +4589,7 @@
               <w:rPr>
                 <w:sz w:val="16"/>
               </w:rPr>
-              <w:t>Implement RSVP confirmation webhook receiver endpoint</w:t>
+              <w:t>Add Share button per guest using `navigator.share()` API (mobile) with clipboard copy fallback (desktop)</w:t>
             </w:r>
           </w:p>
         </w:tc>
@@ -4637,7 +4617,7 @@
               <w:rPr>
                 <w:sz w:val="16"/>
               </w:rPr>
-              <w:t>Maheen</w:t>
+              <w:t>Dileepa</w:t>
             </w:r>
           </w:p>
         </w:tc>
@@ -4651,7 +4631,7 @@
               <w:rPr>
                 <w:sz w:val="16"/>
               </w:rPr>
-              <w:t>4 hrs</w:t>
+              <w:t>3 hours</w:t>
             </w:r>
           </w:p>
         </w:tc>
@@ -4681,7 +4661,7 @@
               <w:rPr>
                 <w:sz w:val="16"/>
               </w:rPr>
-              <w:t>Implement InvitationController endpoints (send, status)</w:t>
+              <w:t>Add Guests route in App.jsx and nav item in Sidebar and MobileBottomNav</w:t>
             </w:r>
           </w:p>
         </w:tc>
@@ -4709,7 +4689,7 @@
               <w:rPr>
                 <w:sz w:val="16"/>
               </w:rPr>
-              <w:t>Maheen</w:t>
+              <w:t>Dileepa</w:t>
             </w:r>
           </w:p>
         </w:tc>
@@ -4723,7 +4703,7 @@
               <w:rPr>
                 <w:sz w:val="16"/>
               </w:rPr>
-              <w:t>3 hrs</w:t>
+              <w:t>1 hour</w:t>
             </w:r>
           </w:p>
         </w:tc>
@@ -4753,7 +4733,7 @@
               <w:rPr>
                 <w:sz w:val="16"/>
               </w:rPr>
-              <w:t>Integrate invitation trigger into Guest List UI (Send Invitation button)</w:t>
+              <w:t>Execute end-to-end test: generate share link, verify clipboard copy, verify share sheet on mobile</w:t>
             </w:r>
           </w:p>
         </w:tc>
@@ -4767,7 +4747,7 @@
               <w:rPr>
                 <w:sz w:val="16"/>
               </w:rPr>
-              <w:t>MAG-6</w:t>
+              <w:t>MAG-13</w:t>
             </w:r>
           </w:p>
         </w:tc>
@@ -4781,7 +4761,7 @@
               <w:rPr>
                 <w:sz w:val="16"/>
               </w:rPr>
-              <w:t>Dileepa</w:t>
+              <w:t>Ruchira</w:t>
             </w:r>
           </w:p>
         </w:tc>
@@ -4795,295 +4775,7 @@
               <w:rPr>
                 <w:sz w:val="16"/>
               </w:rPr>
-              <w:t>4 hrs</w:t>
-            </w:r>
-          </w:p>
-        </w:tc>
-      </w:tr>
-      <w:tr>
-        <w:tc>
-          <w:tcPr>
-            <w:tcW w:type="dxa" w:w="1872"/>
-          </w:tcPr>
-          <w:p>
-            <w:r/>
-            <w:r>
-              <w:rPr>
-                <w:sz w:val="16"/>
-              </w:rPr>
-              <w:t>WA-08</w:t>
-            </w:r>
-          </w:p>
-        </w:tc>
-        <w:tc>
-          <w:tcPr>
-            <w:tcW w:type="dxa" w:w="1872"/>
-          </w:tcPr>
-          <w:p>
-            <w:r/>
-            <w:r>
-              <w:rPr>
-                <w:sz w:val="16"/>
-              </w:rPr>
-              <w:t>Implement Invitation Status column in Guest List</w:t>
-            </w:r>
-          </w:p>
-        </w:tc>
-        <w:tc>
-          <w:tcPr>
-            <w:tcW w:type="dxa" w:w="1872"/>
-          </w:tcPr>
-          <w:p>
-            <w:r/>
-            <w:r>
-              <w:rPr>
-                <w:sz w:val="16"/>
-              </w:rPr>
-              <w:t>MAG-6</w:t>
-            </w:r>
-          </w:p>
-        </w:tc>
-        <w:tc>
-          <w:tcPr>
-            <w:tcW w:type="dxa" w:w="1872"/>
-          </w:tcPr>
-          <w:p>
-            <w:r/>
-            <w:r>
-              <w:rPr>
-                <w:sz w:val="16"/>
-              </w:rPr>
-              <w:t>Dileepa</w:t>
-            </w:r>
-          </w:p>
-        </w:tc>
-        <w:tc>
-          <w:tcPr>
-            <w:tcW w:type="dxa" w:w="1872"/>
-          </w:tcPr>
-          <w:p>
-            <w:r/>
-            <w:r>
-              <w:rPr>
-                <w:sz w:val="16"/>
-              </w:rPr>
-              <w:t>3 hrs</w:t>
-            </w:r>
-          </w:p>
-        </w:tc>
-      </w:tr>
-      <w:tr>
-        <w:tc>
-          <w:tcPr>
-            <w:tcW w:type="dxa" w:w="1872"/>
-          </w:tcPr>
-          <w:p>
-            <w:r/>
-            <w:r>
-              <w:rPr>
-                <w:sz w:val="16"/>
-              </w:rPr>
-              <w:t>WA-09</w:t>
-            </w:r>
-          </w:p>
-        </w:tc>
-        <w:tc>
-          <w:tcPr>
-            <w:tcW w:type="dxa" w:w="1872"/>
-          </w:tcPr>
-          <w:p>
-            <w:r/>
-            <w:r>
-              <w:rPr>
-                <w:sz w:val="16"/>
-              </w:rPr>
-              <w:t>Handle webhook signature verification (X-Hub-Signature-256)</w:t>
-            </w:r>
-          </w:p>
-        </w:tc>
-        <w:tc>
-          <w:tcPr>
-            <w:tcW w:type="dxa" w:w="1872"/>
-          </w:tcPr>
-          <w:p>
-            <w:r/>
-            <w:r>
-              <w:rPr>
-                <w:sz w:val="16"/>
-              </w:rPr>
-              <w:t>MAG-11</w:t>
-            </w:r>
-          </w:p>
-        </w:tc>
-        <w:tc>
-          <w:tcPr>
-            <w:tcW w:type="dxa" w:w="1872"/>
-          </w:tcPr>
-          <w:p>
-            <w:r/>
-            <w:r>
-              <w:rPr>
-                <w:sz w:val="16"/>
-              </w:rPr>
-              <w:t>Maheen</w:t>
-            </w:r>
-          </w:p>
-        </w:tc>
-        <w:tc>
-          <w:tcPr>
-            <w:tcW w:type="dxa" w:w="1872"/>
-          </w:tcPr>
-          <w:p>
-            <w:r/>
-            <w:r>
-              <w:rPr>
-                <w:sz w:val="16"/>
-              </w:rPr>
-              <w:t>3 hrs</w:t>
-            </w:r>
-          </w:p>
-        </w:tc>
-      </w:tr>
-      <w:tr>
-        <w:tc>
-          <w:tcPr>
-            <w:tcW w:type="dxa" w:w="1872"/>
-          </w:tcPr>
-          <w:p>
-            <w:r/>
-            <w:r>
-              <w:rPr>
-                <w:sz w:val="16"/>
-              </w:rPr>
-              <w:t>WA-10</w:t>
-            </w:r>
-          </w:p>
-        </w:tc>
-        <w:tc>
-          <w:tcPr>
-            <w:tcW w:type="dxa" w:w="1872"/>
-          </w:tcPr>
-          <w:p>
-            <w:r/>
-            <w:r>
-              <w:rPr>
-                <w:sz w:val="16"/>
-              </w:rPr>
-              <w:t>Write unit tests for WhatsAppService and integration tests</w:t>
-            </w:r>
-          </w:p>
-        </w:tc>
-        <w:tc>
-          <w:tcPr>
-            <w:tcW w:type="dxa" w:w="1872"/>
-          </w:tcPr>
-          <w:p>
-            <w:r/>
-            <w:r>
-              <w:rPr>
-                <w:sz w:val="16"/>
-              </w:rPr>
-              <w:t>MAG-11</w:t>
-            </w:r>
-          </w:p>
-        </w:tc>
-        <w:tc>
-          <w:tcPr>
-            <w:tcW w:type="dxa" w:w="1872"/>
-          </w:tcPr>
-          <w:p>
-            <w:r/>
-            <w:r>
-              <w:rPr>
-                <w:sz w:val="16"/>
-              </w:rPr>
-              <w:t>Maheen</w:t>
-            </w:r>
-          </w:p>
-        </w:tc>
-        <w:tc>
-          <w:tcPr>
-            <w:tcW w:type="dxa" w:w="1872"/>
-          </w:tcPr>
-          <w:p>
-            <w:r/>
-            <w:r>
-              <w:rPr>
-                <w:sz w:val="16"/>
-              </w:rPr>
-              <w:t>3 hrs</w:t>
-            </w:r>
-          </w:p>
-        </w:tc>
-      </w:tr>
-      <w:tr>
-        <w:tc>
-          <w:tcPr>
-            <w:tcW w:type="dxa" w:w="1872"/>
-          </w:tcPr>
-          <w:p>
-            <w:r/>
-            <w:r>
-              <w:rPr>
-                <w:sz w:val="16"/>
-              </w:rPr>
-              <w:t>WA-11</w:t>
-            </w:r>
-          </w:p>
-        </w:tc>
-        <w:tc>
-          <w:tcPr>
-            <w:tcW w:type="dxa" w:w="1872"/>
-          </w:tcPr>
-          <w:p>
-            <w:r/>
-            <w:r>
-              <w:rPr>
-                <w:sz w:val="16"/>
-              </w:rPr>
-              <w:t>Execute end-to-end WhatsApp invitation test</w:t>
-            </w:r>
-          </w:p>
-        </w:tc>
-        <w:tc>
-          <w:tcPr>
-            <w:tcW w:type="dxa" w:w="1872"/>
-          </w:tcPr>
-          <w:p>
-            <w:r/>
-            <w:r>
-              <w:rPr>
-                <w:sz w:val="16"/>
-              </w:rPr>
-              <w:t>MAG-10</w:t>
-            </w:r>
-          </w:p>
-        </w:tc>
-        <w:tc>
-          <w:tcPr>
-            <w:tcW w:type="dxa" w:w="1872"/>
-          </w:tcPr>
-          <w:p>
-            <w:r/>
-            <w:r>
-              <w:rPr>
-                <w:sz w:val="16"/>
-              </w:rPr>
-              <w:t>Ruchira</w:t>
-            </w:r>
-          </w:p>
-        </w:tc>
-        <w:tc>
-          <w:tcPr>
-            <w:tcW w:type="dxa" w:w="1872"/>
-          </w:tcPr>
-          <w:p>
-            <w:r/>
-            <w:r>
-              <w:rPr>
-                <w:sz w:val="16"/>
-              </w:rPr>
-              <w:t>4 hrs</w:t>
+              <w:t>2 hours</w:t>
             </w:r>
           </w:p>
         </w:tc>
@@ -5092,7 +4784,7 @@
     <w:p/>
     <w:p>
       <w:pPr>
-        <w:pStyle w:val="Heading2"/>
+        <w:pStyle w:val="Heading3"/>
       </w:pPr>
       <w:r>
         <w:rPr>
@@ -5197,7 +4889,7 @@
                 <w:color w:val="FFFFFF"/>
                 <w:sz w:val="16"/>
               </w:rPr>
-              <w:t>Est. Effort</w:t>
+              <w:t>Estimated Effort</w:t>
             </w:r>
           </w:p>
         </w:tc>
@@ -5269,7 +4961,7 @@
               <w:rPr>
                 <w:sz w:val="16"/>
               </w:rPr>
-              <w:t>5 hrs</w:t>
+              <w:t>5 hours</w:t>
             </w:r>
           </w:p>
         </w:tc>
@@ -5299,7 +4991,7 @@
               <w:rPr>
                 <w:sz w:val="16"/>
               </w:rPr>
-              <w:t>Implement User registration and login endpoints</w:t>
+              <w:t>Implement `User` registration and login endpoints (POST /auth/register, POST /auth/login)</w:t>
             </w:r>
           </w:p>
         </w:tc>
@@ -5341,7 +5033,7 @@
               <w:rPr>
                 <w:sz w:val="16"/>
               </w:rPr>
-              <w:t>4 hrs</w:t>
+              <w:t>4 hours</w:t>
             </w:r>
           </w:p>
         </w:tc>
@@ -5413,7 +5105,7 @@
               <w:rPr>
                 <w:sz w:val="16"/>
               </w:rPr>
-              <w:t>4 hrs</w:t>
+              <w:t>4 hours</w:t>
             </w:r>
           </w:p>
         </w:tc>
@@ -5443,7 +5135,7 @@
               <w:rPr>
                 <w:sz w:val="16"/>
               </w:rPr>
-              <w:t>Set up global exception handler (@ControllerAdvice)</w:t>
+              <w:t>Set up global exception handler (`@ControllerAdvice`) with standardized error response format</w:t>
             </w:r>
           </w:p>
         </w:tc>
@@ -5485,7 +5177,7 @@
               <w:rPr>
                 <w:sz w:val="16"/>
               </w:rPr>
-              <w:t>3 hrs</w:t>
+              <w:t>3 hours</w:t>
             </w:r>
           </w:p>
         </w:tc>
@@ -5515,7 +5207,7 @@
               <w:rPr>
                 <w:sz w:val="16"/>
               </w:rPr>
-              <w:t>Configure CORS policy for frontend origin</w:t>
+              <w:t>Configure CORS policy for frontend origin (Vercel dev + production)</w:t>
             </w:r>
           </w:p>
         </w:tc>
@@ -5557,7 +5249,7 @@
               <w:rPr>
                 <w:sz w:val="16"/>
               </w:rPr>
-              <w:t>2 hrs</w:t>
+              <w:t>2 hours</w:t>
             </w:r>
           </w:p>
         </w:tc>
@@ -5587,7 +5279,7 @@
               <w:rPr>
                 <w:sz w:val="16"/>
               </w:rPr>
-              <w:t>Set up Vercel project and configure environment variables</w:t>
+              <w:t>Set up Vercel project and configure environment variables for deployment</w:t>
             </w:r>
           </w:p>
         </w:tc>
@@ -5629,7 +5321,7 @@
               <w:rPr>
                 <w:sz w:val="16"/>
               </w:rPr>
-              <w:t>3 hrs</w:t>
+              <w:t>3 hours</w:t>
             </w:r>
           </w:p>
         </w:tc>
@@ -5701,7 +5393,7 @@
               <w:rPr>
                 <w:sz w:val="16"/>
               </w:rPr>
-              <w:t>3 hrs</w:t>
+              <w:t>3 hours</w:t>
             </w:r>
           </w:p>
         </w:tc>
@@ -5731,7 +5423,7 @@
               <w:rPr>
                 <w:sz w:val="16"/>
               </w:rPr>
-              <w:t>Write and execute system integration test plan</w:t>
+              <w:t>Write and execute system integration test plan across all four modules</w:t>
             </w:r>
           </w:p>
         </w:tc>
@@ -5773,7 +5465,7 @@
               <w:rPr>
                 <w:sz w:val="16"/>
               </w:rPr>
-              <w:t>8 hrs</w:t>
+              <w:t>8 hours</w:t>
             </w:r>
           </w:p>
         </w:tc>
@@ -5803,7 +5495,7 @@
               <w:rPr>
                 <w:sz w:val="16"/>
               </w:rPr>
-              <w:t>Maintain defect register with severity classification and resolution tracking</w:t>
+              <w:t>Maintain defect register with severity classification, reproduction steps, and resolution tracking</w:t>
             </w:r>
           </w:p>
         </w:tc>
@@ -5845,7 +5537,7 @@
               <w:rPr>
                 <w:sz w:val="16"/>
               </w:rPr>
-              <w:t>4 hrs</w:t>
+              <w:t>4 hours</w:t>
             </w:r>
           </w:p>
         </w:tc>
@@ -5875,7 +5567,7 @@
               <w:rPr>
                 <w:sz w:val="16"/>
               </w:rPr>
-              <w:t>Compile sprint review reports with burndown charts and velocity metrics</w:t>
+              <w:t>Compile sprint review reports (Sprint 1, 2, 3) with burndown charts and velocity metrics</w:t>
             </w:r>
           </w:p>
         </w:tc>
@@ -5917,7 +5609,7 @@
               <w:rPr>
                 <w:sz w:val="16"/>
               </w:rPr>
-              <w:t>6 hrs</w:t>
+              <w:t>6 hours</w:t>
             </w:r>
           </w:p>
         </w:tc>
@@ -5989,7 +5681,7 @@
               <w:rPr>
                 <w:sz w:val="16"/>
               </w:rPr>
-              <w:t>8 hrs</w:t>
+              <w:t>8 hours</w:t>
             </w:r>
           </w:p>
         </w:tc>
@@ -5998,7 +5690,7 @@
     <w:p/>
     <w:p>
       <w:pPr>
-        <w:pStyle w:val="Heading2"/>
+        <w:pStyle w:val="Heading3"/>
       </w:pPr>
       <w:r>
         <w:rPr>
@@ -6674,7 +6366,7 @@
               <w:rPr>
                 <w:sz w:val="16"/>
               </w:rPr>
-              <w:t>Sprint 2</w:t>
+              <w:t>Sprint 3</w:t>
             </w:r>
           </w:p>
         </w:tc>
@@ -6704,7 +6396,7 @@
               <w:rPr>
                 <w:sz w:val="16"/>
               </w:rPr>
-              <w:t>WhatsApp Business API Integration</w:t>
+              <w:t>Share Invitations (Web Share API)</w:t>
             </w:r>
           </w:p>
         </w:tc>
@@ -6733,6 +6425,238 @@
                 <w:sz w:val="16"/>
               </w:rPr>
               <w:t>Sprint 2</w:t>
+            </w:r>
+          </w:p>
+        </w:tc>
+      </w:tr>
+      <w:tr>
+        <w:tc>
+          <w:tcPr>
+            <w:tcW w:type="dxa" w:w="2340"/>
+          </w:tcPr>
+          <w:p>
+            <w:r/>
+            <w:r>
+              <w:rPr>
+                <w:sz w:val="16"/>
+              </w:rPr>
+              <w:t>MAG-12</w:t>
+            </w:r>
+          </w:p>
+        </w:tc>
+        <w:tc>
+          <w:tcPr>
+            <w:tcW w:type="dxa" w:w="2340"/>
+          </w:tcPr>
+          <w:p>
+            <w:r/>
+            <w:r>
+              <w:rPr>
+                <w:sz w:val="16"/>
+              </w:rPr>
+              <w:t>Deploy Frontend to Vercel</w:t>
+            </w:r>
+          </w:p>
+        </w:tc>
+        <w:tc>
+          <w:tcPr>
+            <w:tcW w:type="dxa" w:w="2340"/>
+          </w:tcPr>
+          <w:p>
+            <w:r/>
+            <w:r>
+              <w:rPr>
+                <w:sz w:val="16"/>
+              </w:rPr>
+              <w:t>DevOps</w:t>
+            </w:r>
+          </w:p>
+        </w:tc>
+        <w:tc>
+          <w:tcPr>
+            <w:tcW w:type="dxa" w:w="2340"/>
+          </w:tcPr>
+          <w:p>
+            <w:r/>
+            <w:r>
+              <w:rPr>
+                <w:sz w:val="16"/>
+              </w:rPr>
+              <w:t>Sprint 3</w:t>
+            </w:r>
+          </w:p>
+        </w:tc>
+      </w:tr>
+      <w:tr>
+        <w:tc>
+          <w:tcPr>
+            <w:tcW w:type="dxa" w:w="2340"/>
+          </w:tcPr>
+          <w:p>
+            <w:r/>
+            <w:r>
+              <w:rPr>
+                <w:sz w:val="16"/>
+              </w:rPr>
+              <w:t>MAG-13</w:t>
+            </w:r>
+          </w:p>
+        </w:tc>
+        <w:tc>
+          <w:tcPr>
+            <w:tcW w:type="dxa" w:w="2340"/>
+          </w:tcPr>
+          <w:p>
+            <w:r/>
+            <w:r>
+              <w:rPr>
+                <w:sz w:val="16"/>
+              </w:rPr>
+              <w:t>Deploy Backend &amp; Database to Render</w:t>
+            </w:r>
+          </w:p>
+        </w:tc>
+        <w:tc>
+          <w:tcPr>
+            <w:tcW w:type="dxa" w:w="2340"/>
+          </w:tcPr>
+          <w:p>
+            <w:r/>
+            <w:r>
+              <w:rPr>
+                <w:sz w:val="16"/>
+              </w:rPr>
+              <w:t>DevOps</w:t>
+            </w:r>
+          </w:p>
+        </w:tc>
+        <w:tc>
+          <w:tcPr>
+            <w:tcW w:type="dxa" w:w="2340"/>
+          </w:tcPr>
+          <w:p>
+            <w:r/>
+            <w:r>
+              <w:rPr>
+                <w:sz w:val="16"/>
+              </w:rPr>
+              <w:t>Sprint 3</w:t>
+            </w:r>
+          </w:p>
+        </w:tc>
+      </w:tr>
+      <w:tr>
+        <w:tc>
+          <w:tcPr>
+            <w:tcW w:type="dxa" w:w="2340"/>
+          </w:tcPr>
+          <w:p>
+            <w:r/>
+            <w:r>
+              <w:rPr>
+                <w:sz w:val="16"/>
+              </w:rPr>
+              <w:t>MAG-14</w:t>
+            </w:r>
+          </w:p>
+        </w:tc>
+        <w:tc>
+          <w:tcPr>
+            <w:tcW w:type="dxa" w:w="2340"/>
+          </w:tcPr>
+          <w:p>
+            <w:r/>
+            <w:r>
+              <w:rPr>
+                <w:sz w:val="16"/>
+              </w:rPr>
+              <w:t>System Testing &amp; Defect Management</w:t>
+            </w:r>
+          </w:p>
+        </w:tc>
+        <w:tc>
+          <w:tcPr>
+            <w:tcW w:type="dxa" w:w="2340"/>
+          </w:tcPr>
+          <w:p>
+            <w:r/>
+            <w:r>
+              <w:rPr>
+                <w:sz w:val="16"/>
+              </w:rPr>
+              <w:t>QA</w:t>
+            </w:r>
+          </w:p>
+        </w:tc>
+        <w:tc>
+          <w:tcPr>
+            <w:tcW w:type="dxa" w:w="2340"/>
+          </w:tcPr>
+          <w:p>
+            <w:r/>
+            <w:r>
+              <w:rPr>
+                <w:sz w:val="16"/>
+              </w:rPr>
+              <w:t>Sprint 3</w:t>
+            </w:r>
+          </w:p>
+        </w:tc>
+      </w:tr>
+      <w:tr>
+        <w:tc>
+          <w:tcPr>
+            <w:tcW w:type="dxa" w:w="2340"/>
+          </w:tcPr>
+          <w:p>
+            <w:r/>
+            <w:r>
+              <w:rPr>
+                <w:sz w:val="16"/>
+              </w:rPr>
+              <w:t>MAG-15</w:t>
+            </w:r>
+          </w:p>
+        </w:tc>
+        <w:tc>
+          <w:tcPr>
+            <w:tcW w:type="dxa" w:w="2340"/>
+          </w:tcPr>
+          <w:p>
+            <w:r/>
+            <w:r>
+              <w:rPr>
+                <w:sz w:val="16"/>
+              </w:rPr>
+              <w:t>Final Documentation &amp; Presentation</w:t>
+            </w:r>
+          </w:p>
+        </w:tc>
+        <w:tc>
+          <w:tcPr>
+            <w:tcW w:type="dxa" w:w="2340"/>
+          </w:tcPr>
+          <w:p>
+            <w:r/>
+            <w:r>
+              <w:rPr>
+                <w:sz w:val="16"/>
+              </w:rPr>
+              <w:t>Management</w:t>
+            </w:r>
+          </w:p>
+        </w:tc>
+        <w:tc>
+          <w:tcPr>
+            <w:tcW w:type="dxa" w:w="2340"/>
+          </w:tcPr>
+          <w:p>
+            <w:r/>
+            <w:r>
+              <w:rPr>
+                <w:sz w:val="16"/>
+              </w:rPr>
+              <w:t>Sprint 3</w:t>
             </w:r>
           </w:p>
         </w:tc>
@@ -6740,8 +6664,13 @@
     </w:tbl>
     <w:p/>
     <w:p>
+      <w:r>
+        <w:t>────────────────────────────────────────────────────────────</w:t>
+      </w:r>
+    </w:p>
+    <w:p>
       <w:pPr>
-        <w:pStyle w:val="Heading1"/>
+        <w:pStyle w:val="Heading2"/>
       </w:pPr>
       <w:r>
         <w:rPr>
@@ -6752,7 +6681,7 @@
     </w:p>
     <w:p>
       <w:pPr>
-        <w:pStyle w:val="Heading2"/>
+        <w:pStyle w:val="Heading3"/>
       </w:pPr>
       <w:r>
         <w:rPr>
@@ -6767,7 +6696,7 @@
           <w:b w:val="0"/>
           <w:i w:val="0"/>
         </w:rPr>
-        <w:t>The team uses Jira as the central project management tool. All user stories, tasks, and bugs are maintained on a Kanban board with the following columns:</w:t>
+        <w:t>The team uses **Jira** as the central project management tool. All user stories, tasks, and bugs are maintained on a Kanban board with the following columns:</w:t>
       </w:r>
     </w:p>
     <w:p>
@@ -6775,7 +6704,7 @@
         <w:pStyle w:val="ListBullet"/>
       </w:pPr>
       <w:r>
-        <w:t>To Do: Backlog items ready for selection in the current sprint.</w:t>
+        <w:t>**To Do:** Backlog items ready for selection in the current sprint.</w:t>
       </w:r>
     </w:p>
     <w:p>
@@ -6783,7 +6712,7 @@
         <w:pStyle w:val="ListBullet"/>
       </w:pPr>
       <w:r>
-        <w:t>In Progress: Tasks actively being worked on by an assigned team member.</w:t>
+        <w:t>**In Progress:** Tasks actively being worked on by an assigned team member.</w:t>
       </w:r>
     </w:p>
     <w:p>
@@ -6791,7 +6720,7 @@
         <w:pStyle w:val="ListBullet"/>
       </w:pPr>
       <w:r>
-        <w:t>In Review: Completed work awaiting code review by the Project Manager before merge.</w:t>
+        <w:t>**In Review:** Completed work awaiting code review by the Project Manager before merge.</w:t>
       </w:r>
     </w:p>
     <w:p>
@@ -6799,7 +6728,7 @@
         <w:pStyle w:val="ListBullet"/>
       </w:pPr>
       <w:r>
-        <w:t>Done: Tasks that have been reviewed, merged, and meet the definition of done.</w:t>
+        <w:t>**Done:** Tasks that have been reviewed, merged, and meet the definition of done.</w:t>
       </w:r>
     </w:p>
     <w:p>
@@ -6813,7 +6742,7 @@
     </w:p>
     <w:p>
       <w:pPr>
-        <w:pStyle w:val="Heading2"/>
+        <w:pStyle w:val="Heading3"/>
       </w:pPr>
       <w:r>
         <w:rPr>
@@ -6828,7 +6757,7 @@
           <w:b w:val="0"/>
           <w:i w:val="0"/>
         </w:rPr>
-        <w:t>The project uses GitHub for version control under a monorepo structure (maheensayuru/MagulaPlan). The repository is organized into three top-level directories: frontend/, backend/, and docs/. The following policies are enforced:</w:t>
+        <w:t>The project uses **GitHub** for version control under a monorepo structure (`maheensayuru/MagulaPlan`). The repository is organized into three top-level directories: `frontend/`, `backend/`, and `docs/`. The following policies are enforced:</w:t>
       </w:r>
     </w:p>
     <w:p>
@@ -6836,7 +6765,7 @@
         <w:pStyle w:val="ListBullet"/>
       </w:pPr>
       <w:r>
-        <w:t>No direct pushes to main. The main branch is protected and requires at least one approving review before merge.</w:t>
+        <w:t>**No direct pushes to `main`.** The `main` branch is protected and requires at least one approving review before merge.</w:t>
       </w:r>
     </w:p>
     <w:p>
@@ -6844,7 +6773,7 @@
         <w:pStyle w:val="ListBullet"/>
       </w:pPr>
       <w:r>
-        <w:t>Feature branches. All work is conducted on feature branches named feat/MAG-N-brief-description or chore/brief-description. Branches are created from and merged back to main via pull requests.</w:t>
+        <w:t>**Feature branches.** All work is conducted on feature branches named `feat/MAG-N-brief-description` or `chore/brief-description`. Branches are created from and merged back to `main` via pull requests.</w:t>
       </w:r>
     </w:p>
     <w:p>
@@ -6852,7 +6781,7 @@
         <w:pStyle w:val="ListBullet"/>
       </w:pPr>
       <w:r>
-        <w:t>Pull Request reviews. The Project Manager reviews every pull request for architectural alignment, code quality, and adherence to project conventions before approving the merge.</w:t>
+        <w:t>**Pull Request reviews.** The Project Manager reviews every pull request for architectural alignment, code quality, and adherence to project conventions before approving the merge. Review feedback is delivered via GitHub's PR comment system and discussed asynchronously.</w:t>
       </w:r>
     </w:p>
     <w:p>
@@ -6860,12 +6789,12 @@
         <w:pStyle w:val="ListBullet"/>
       </w:pPr>
       <w:r>
-        <w:t>Commit conventions. Team members use conventional commit prefixes (feat:, fix:, chore:, docs:) for readable git history.</w:t>
+        <w:t>**Commit conventions.** Team members are encouraged to use conventional commit prefixes (`feat:`, `fix:`, `chore:`, `docs:`) for readable git history.</w:t>
       </w:r>
     </w:p>
     <w:p>
       <w:pPr>
-        <w:pStyle w:val="Heading2"/>
+        <w:pStyle w:val="Heading3"/>
       </w:pPr>
       <w:r>
         <w:rPr>
@@ -6880,7 +6809,7 @@
           <w:b w:val="0"/>
           <w:i w:val="0"/>
         </w:rPr>
-        <w:t>The team maintains a dedicated WhatsApp group for daily coordination. Communication follows a structured cadence:</w:t>
+        <w:t>The team maintains a dedicated **WhatsApp group** for daily coordination. Communication follows a structured cadence:</w:t>
       </w:r>
     </w:p>
     <w:p>
@@ -6888,7 +6817,7 @@
         <w:pStyle w:val="ListBullet"/>
       </w:pPr>
       <w:r>
-        <w:t>Daily stand-ups (async): Each member posts a brief update covering what they completed, what they plan to work on next, and any blockers. The Project Manager consolidates these into the Jira board.</w:t>
+        <w:t>**Daily stand-ups (async):** Each member posts a brief update covering what they completed, what they plan to work on next, and any blockers they are facing. The Project Manager consolidates these into the Jira board and addresses blockers within the same day.</w:t>
       </w:r>
     </w:p>
     <w:p>
@@ -6896,7 +6825,7 @@
         <w:pStyle w:val="ListBullet"/>
       </w:pPr>
       <w:r>
-        <w:t>Sprint planning and retrospectives: Held via WhatsApp voice call at the start and end of each sprint.</w:t>
+        <w:t>**Sprint planning and retrospectives:** Held via WhatsApp voice call at the start and end of each sprint. The team reviews the sprint backlog, assigns tasks, estimates effort, and reflects on process improvements.</w:t>
       </w:r>
     </w:p>
     <w:p>
@@ -6904,12 +6833,12 @@
         <w:pStyle w:val="ListBullet"/>
       </w:pPr>
       <w:r>
-        <w:t>Ad-hoc technical discussions: Pair programming sessions and blocker resolution are coordinated directly between affected members, with key decisions summarized in the WhatsApp group for visibility.</w:t>
+        <w:t>**Ad-hoc technical discussions:** Pair programming sessions and blocker resolution are coordinated directly between affected members, with key decisions summarized in the WhatsApp group for visibility.</w:t>
       </w:r>
     </w:p>
     <w:p>
       <w:pPr>
-        <w:pStyle w:val="Heading2"/>
+        <w:pStyle w:val="Heading3"/>
       </w:pPr>
       <w:r>
         <w:rPr>
@@ -6924,12 +6853,17 @@
           <w:b w:val="0"/>
           <w:i w:val="0"/>
         </w:rPr>
-        <w:t>All project documentation — including this Project Management Plan, the system design report, sprint review summaries, and presentation materials — is stored in the docs/ directory of the GitHub repository. This ensures version-controlled, single-source access for all team members and lecturers. Final deliverables are exported to PDF for submission.</w:t>
+        <w:t>All project documentation — including this Project Management Plan, the system design report, sprint review summaries, and presentation materials — is stored in the `docs/` directory of the GitHub repository. This ensures version-controlled, single-source access for all team members and lecturers. Final deliverables are exported to PDF for submission.</w:t>
+      </w:r>
+    </w:p>
+    <w:p>
+      <w:r>
+        <w:t>────────────────────────────────────────────────────────────</w:t>
       </w:r>
     </w:p>
     <w:p>
       <w:pPr>
-        <w:pStyle w:val="Heading1"/>
+        <w:pStyle w:val="Heading2"/>
       </w:pPr>
       <w:r>
         <w:rPr>
@@ -7074,7 +7008,7 @@
               <w:rPr>
                 <w:sz w:val="16"/>
               </w:rPr>
-              <w:t>Begin Meta Developer account registration early in Sprint 2; have a manual invitation fallback ready</w:t>
+              <w:t>Replaced with Web Share API (navigator.share) — no Meta approval required; clipboard copy fallback covers desktop browsers</w:t>
             </w:r>
           </w:p>
         </w:tc>
@@ -7132,7 +7066,7 @@
               <w:rPr>
                 <w:sz w:val="16"/>
               </w:rPr>
-              <w:t>Project Manager (Maheen) is cross-trained on Spring Boot and can implement assigned modules independently</w:t>
+              <w:t>Project Manager (Maheen) is cross-trained on Spring Boot and can implement assigned modules (MAG-11) independently</w:t>
             </w:r>
           </w:p>
         </w:tc>
@@ -7148,7 +7082,7 @@
               <w:rPr>
                 <w:sz w:val="16"/>
               </w:rPr>
-              <w:t>Frontend-backend integration issues</w:t>
+              <w:t>Frontend-backend integration issues at sprint boundaries</w:t>
             </w:r>
           </w:p>
         </w:tc>
@@ -7190,7 +7124,7 @@
               <w:rPr>
                 <w:sz w:val="16"/>
               </w:rPr>
-              <w:t>Schedule mid-sprint integration checkpoints; define API contracts before implementation</w:t>
+              <w:t>Schedule a mid-sprint integration checkpoint in each sprint; define API contracts (request/response shapes) before implementation begins</w:t>
             </w:r>
           </w:p>
         </w:tc>
@@ -7206,7 +7140,7 @@
               <w:rPr>
                 <w:sz w:val="16"/>
               </w:rPr>
-              <w:t>MySQL schema changes after development starts</w:t>
+              <w:t>MySQL schema changes after backend development starts</w:t>
             </w:r>
           </w:p>
         </w:tc>
@@ -7248,7 +7182,7 @@
               <w:rPr>
                 <w:sz w:val="16"/>
               </w:rPr>
-              <w:t>Freeze the schema at end of Sprint 1; post-freeze changes require a migration script</w:t>
+              <w:t>Freeze the schema at the end of Sprint 1; any post-freeze changes require a migration script and team-wide notification</w:t>
             </w:r>
           </w:p>
         </w:tc>
@@ -7264,7 +7198,7 @@
               <w:rPr>
                 <w:sz w:val="16"/>
               </w:rPr>
-              <w:t>Team member unavailability</w:t>
+              <w:t>Team member unavailability due to academic workload</w:t>
             </w:r>
           </w:p>
         </w:tc>
@@ -7306,7 +7240,7 @@
               <w:rPr>
                 <w:sz w:val="16"/>
               </w:rPr>
-              <w:t>All tasks have documented acceptance criteria; any member can pick up partially completed tasks</w:t>
+              <w:t>All tasks have documented acceptance criteria; any member can pick up a partially completed task with minimal onboarding</w:t>
             </w:r>
           </w:p>
         </w:tc>
@@ -7364,7 +7298,7 @@
               <w:rPr>
                 <w:sz w:val="16"/>
               </w:rPr>
-              <w:t>Use Spring profiles and Vercel environment variables; document all config in README</w:t>
+              <w:t>Use Spring profiles (`application-local.properties`, `application-prod.properties`) and Vercel environment variables; document all config in README</w:t>
             </w:r>
           </w:p>
         </w:tc>
@@ -7372,8 +7306,13 @@
     </w:tbl>
     <w:p/>
     <w:p>
+      <w:r>
+        <w:t>────────────────────────────────────────────────────────────</w:t>
+      </w:r>
+    </w:p>
+    <w:p>
       <w:pPr>
-        <w:pStyle w:val="Heading1"/>
+        <w:pStyle w:val="Heading2"/>
       </w:pPr>
       <w:r>
         <w:rPr>
@@ -7396,7 +7335,7 @@
         <w:pStyle w:val="ListBullet"/>
       </w:pPr>
       <w:r>
-        <w:t>Unit Testing: Backend developers write JUnit 5 unit tests for all service-layer classes. Frontend components are manually verified during development with a checklist-based approach.</w:t>
+        <w:t>**Unit Testing:** Backend developers write JUnit 5 unit tests for all service-layer classes. Frontend components are manually verified during development with a checklist-based approach.</w:t>
       </w:r>
     </w:p>
     <w:p>
@@ -7404,7 +7343,7 @@
         <w:pStyle w:val="ListBullet"/>
       </w:pPr>
       <w:r>
-        <w:t>Integration Testing: Spring Boot integration tests (@SpringBootTest) validate controller endpoints against an in-memory database. API contracts are verified with Postman collections.</w:t>
+        <w:t>**Integration Testing:** Spring Boot integration tests (`@SpringBootTest`) validate controller endpoints against an in-memory database. Frontend-to-backend API contracts are verified with Postman collections maintained alongside the codebase.</w:t>
       </w:r>
     </w:p>
     <w:p>
@@ -7412,7 +7351,7 @@
         <w:pStyle w:val="ListBullet"/>
       </w:pPr>
       <w:r>
-        <w:t>System Testing: The QA Engineer executes a structured system test plan during Sprint 3, covering functional correctness, cross-browser compatibility, responsive design, and error handling. All defects are logged in Jira with severity classification (Critical, Major, Minor, Cosmetic), reproduction steps, and environment details.</w:t>
+        <w:t>**System Testing:** The QA Engineer (Ruchira) executes a structured system test plan during Sprint 3, covering functional correctness, cross-browser compatibility, responsive design behavior, and error handling. All defects are logged in Jira with severity classification (Critical, Major, Minor, Cosmetic), reproduction steps, expected versus actual behavior, and environment details.</w:t>
       </w:r>
     </w:p>
     <w:p>
@@ -7420,17 +7359,21 @@
         <w:pStyle w:val="ListBullet"/>
       </w:pPr>
       <w:r>
-        <w:t>Defect Management: Resolved defects are assigned back to the QA Engineer for retesting and closure. The defect register is reviewed during each sprint retrospective to identify recurring patterns.</w:t>
+        <w:t>**Defect Management:** Resolved defects are assigned back to the QA Engineer for retesting and closure. The defect register is reviewed during each sprint retrospective to identify recurring patterns and process improvements.</w:t>
       </w:r>
     </w:p>
-    <w:p/>
+    <w:p>
+      <w:r>
+        <w:t>────────────────────────────────────────────────────────────</w:t>
+      </w:r>
+    </w:p>
     <w:p>
       <w:r>
         <w:rPr>
           <w:b w:val="0"/>
-          <w:i/>
+          <w:i w:val="0"/>
         </w:rPr>
-        <w:t>This Project Management Plan is a living document. It will be reviewed and updated at the conclusion of each sprint to reflect actual progress, revised estimates, and any changes to team allocation or project scope.</w:t>
+        <w:t>*This Project Management Plan is a living document. It will be reviewed and updated at the conclusion of each sprint to reflect actual progress, revised estimates, and any changes to team allocation or project scope.*</w:t>
       </w:r>
     </w:p>
     <w:sectPr>

</xml_diff>

<commit_message>
docs: add MAG-16/17/18 to Sprint 3 (Spring Security, API integration, DB verification)
</commit_message>
<xml_diff>
--- a/docs/Project_Management_Plan.docx
+++ b/docs/Project_Management_Plan.docx
@@ -925,7 +925,7 @@
           <w:b w:val="0"/>
           <w:i w:val="0"/>
         </w:rPr>
-        <w:t>The final sprint completes the MVP and prepares it for submission. Ruchira carries over MAG-10 (Automated JUnit Tests) from Sprint 2, writing unit and integration tests for the Guest, User, Budget, Vendor, and VendorCategory service layers using JUnit 5, Mockito, and an H2 in-memory database. In parallel, she executes the full system test plan, logging defects in a structured defect register with severity classifications and retesting resolved issues. Sammani deploys the React frontend to Vercel with environment-specific configuration and the Spring Boot API and MySQL database to Render with connection string and secret management in place. Dileepa polishes UI components, implements the Guest List page with Web Share API invitation buttons, and connects frontend forms to the live backend API endpoints. The project manager compiles the final project documentation, including the system design report, sprint review summaries, and the end-of-semester presentation slide deck.</w:t>
+        <w:t>The final sprint completes the MVP and prepares it for submission. Ruchira carries over MAG-10 (Automated JUnit Tests) from Sprint 2, writing unit and integration tests for the Guest, User, Budget, Vendor, and VendorCategory service layers using JUnit 5, Mockito, and an H2 in-memory database. In parallel, she executes the full system test plan (MAG-14), logging defects in a structured defect register with severity classifications and retesting resolved issues. Amanda implements Spring Security with JWT-based authentication (MAG-16), configuring the filter chain, building user registration and login endpoints, and adding a global exception handler. Dileepa replaces the frontend mock data with live API integration (MAG-17), connecting the Guest List, Dashboard, Vendor Directory, and Budget pages to the Spring Boot REST endpoints. Sammani supports deployment verification (MAG-18), ensuring the MySQL schema on Render matches the development database and assisting with environment configuration. The project manager deploys the frontend to Vercel (MAG-12) and the backend with database to Render (MAG-13), then compiles the final project documentation and presentation (MAG-15).</w:t>
       </w:r>
     </w:p>
     <w:p>
@@ -6643,6 +6643,180 @@
                 <w:sz w:val="16"/>
               </w:rPr>
               <w:t>Management</w:t>
+            </w:r>
+          </w:p>
+        </w:tc>
+        <w:tc>
+          <w:tcPr>
+            <w:tcW w:type="dxa" w:w="2340"/>
+          </w:tcPr>
+          <w:p>
+            <w:r/>
+            <w:r>
+              <w:rPr>
+                <w:sz w:val="16"/>
+              </w:rPr>
+              <w:t>Sprint 3</w:t>
+            </w:r>
+          </w:p>
+        </w:tc>
+      </w:tr>
+      <w:tr>
+        <w:tc>
+          <w:tcPr>
+            <w:tcW w:type="dxa" w:w="2340"/>
+          </w:tcPr>
+          <w:p>
+            <w:r/>
+            <w:r>
+              <w:rPr>
+                <w:sz w:val="16"/>
+              </w:rPr>
+              <w:t>MAG-16</w:t>
+            </w:r>
+          </w:p>
+        </w:tc>
+        <w:tc>
+          <w:tcPr>
+            <w:tcW w:type="dxa" w:w="2340"/>
+          </w:tcPr>
+          <w:p>
+            <w:r/>
+            <w:r>
+              <w:rPr>
+                <w:sz w:val="16"/>
+              </w:rPr>
+              <w:t>Spring Security &amp; JWT Authentication</w:t>
+            </w:r>
+          </w:p>
+        </w:tc>
+        <w:tc>
+          <w:tcPr>
+            <w:tcW w:type="dxa" w:w="2340"/>
+          </w:tcPr>
+          <w:p>
+            <w:r/>
+            <w:r>
+              <w:rPr>
+                <w:sz w:val="16"/>
+              </w:rPr>
+              <w:t>Backend</w:t>
+            </w:r>
+          </w:p>
+        </w:tc>
+        <w:tc>
+          <w:tcPr>
+            <w:tcW w:type="dxa" w:w="2340"/>
+          </w:tcPr>
+          <w:p>
+            <w:r/>
+            <w:r>
+              <w:rPr>
+                <w:sz w:val="16"/>
+              </w:rPr>
+              <w:t>Sprint 3</w:t>
+            </w:r>
+          </w:p>
+        </w:tc>
+      </w:tr>
+      <w:tr>
+        <w:tc>
+          <w:tcPr>
+            <w:tcW w:type="dxa" w:w="2340"/>
+          </w:tcPr>
+          <w:p>
+            <w:r/>
+            <w:r>
+              <w:rPr>
+                <w:sz w:val="16"/>
+              </w:rPr>
+              <w:t>MAG-17</w:t>
+            </w:r>
+          </w:p>
+        </w:tc>
+        <w:tc>
+          <w:tcPr>
+            <w:tcW w:type="dxa" w:w="2340"/>
+          </w:tcPr>
+          <w:p>
+            <w:r/>
+            <w:r>
+              <w:rPr>
+                <w:sz w:val="16"/>
+              </w:rPr>
+              <w:t>Frontend-Backend API Integration</w:t>
+            </w:r>
+          </w:p>
+        </w:tc>
+        <w:tc>
+          <w:tcPr>
+            <w:tcW w:type="dxa" w:w="2340"/>
+          </w:tcPr>
+          <w:p>
+            <w:r/>
+            <w:r>
+              <w:rPr>
+                <w:sz w:val="16"/>
+              </w:rPr>
+              <w:t>Frontend</w:t>
+            </w:r>
+          </w:p>
+        </w:tc>
+        <w:tc>
+          <w:tcPr>
+            <w:tcW w:type="dxa" w:w="2340"/>
+          </w:tcPr>
+          <w:p>
+            <w:r/>
+            <w:r>
+              <w:rPr>
+                <w:sz w:val="16"/>
+              </w:rPr>
+              <w:t>Sprint 3</w:t>
+            </w:r>
+          </w:p>
+        </w:tc>
+      </w:tr>
+      <w:tr>
+        <w:tc>
+          <w:tcPr>
+            <w:tcW w:type="dxa" w:w="2340"/>
+          </w:tcPr>
+          <w:p>
+            <w:r/>
+            <w:r>
+              <w:rPr>
+                <w:sz w:val="16"/>
+              </w:rPr>
+              <w:t>MAG-18</w:t>
+            </w:r>
+          </w:p>
+        </w:tc>
+        <w:tc>
+          <w:tcPr>
+            <w:tcW w:type="dxa" w:w="2340"/>
+          </w:tcPr>
+          <w:p>
+            <w:r/>
+            <w:r>
+              <w:rPr>
+                <w:sz w:val="16"/>
+              </w:rPr>
+              <w:t>Deployment Support &amp; DB Verification</w:t>
+            </w:r>
+          </w:p>
+        </w:tc>
+        <w:tc>
+          <w:tcPr>
+            <w:tcW w:type="dxa" w:w="2340"/>
+          </w:tcPr>
+          <w:p>
+            <w:r/>
+            <w:r>
+              <w:rPr>
+                <w:sz w:val="16"/>
+              </w:rPr>
+              <w:t>Database</w:t>
             </w:r>
           </w:p>
         </w:tc>

</xml_diff>

<commit_message>
docs: sync PM plan Jira reference with actual board IDs (MAG-15 to MAG-25) and frontend tickets
</commit_message>
<xml_diff>
--- a/docs/Project_Management_Plan.docx
+++ b/docs/Project_Management_Plan.docx
@@ -925,7 +925,7 @@
           <w:b w:val="0"/>
           <w:i w:val="0"/>
         </w:rPr>
-        <w:t>The final sprint completes the MVP and prepares it for submission. Ruchira carries over MAG-10 (Automated JUnit Tests) from Sprint 2, writing unit and integration tests for the Guest, User, Budget, Vendor, and VendorCategory service layers using JUnit 5, Mockito, and an H2 in-memory database. In parallel, she executes the full system test plan (MAG-14), logging defects in a structured defect register with severity classifications and retesting resolved issues. Amanda implements Spring Security with JWT-based authentication (MAG-16), configuring the filter chain, building user registration and login endpoints, and adding a global exception handler. Dileepa replaces the frontend mock data with live API integration (MAG-17), connecting the Guest List, Dashboard, Vendor Directory, and Budget pages to the Spring Boot REST endpoints. Sammani supports deployment verification (MAG-18), ensuring the MySQL schema on Render matches the development database and assisting with environment configuration. The project manager deploys the frontend to Vercel (MAG-12) and the backend with database to Render (MAG-13), then compiles the final project documentation and presentation (MAG-15).</w:t>
+        <w:t>The final sprint completes the MVP and prepares it for submission. Ruchira carries over MAG-10 (Automated JUnit Tests) from Sprint 2, writing unit and integration tests for the Guest, User, Budget, Vendor, and VendorCategory service layers using JUnit 5, Mockito, and an H2 in-memory database. In parallel, she executes the full system test plan (MAG-17), logging defects in a structured defect register with severity classifications and retesting resolved issues. Amanda implements Spring Security with JWT-based authentication (MAG-19), configuring the filter chain, building user registration and login endpoints, and adding a global exception handler. Dileepa completes the frontend: wiring all pages to the live backend API (MAG-20), building the Budget Tracker page (MAG-22), implementing authentication and protected routes (MAG-23), and building shared UI components with Guest List CRUD (MAG-24). Amanda and Dileepa jointly enrich the vendor model with image, rating, and verification fields (MAG-25). Sammani supports deployment verification (MAG-21), ensuring the MySQL schema on Render matches the development database. The project manager deploys the frontend to Vercel (MAG-15) and the backend with database to Render (MAG-16), then compiles the final project documentation and presentation (MAG-18).</w:t>
       </w:r>
     </w:p>
     <w:p>
@@ -6048,7 +6048,7 @@
               <w:rPr>
                 <w:sz w:val="16"/>
               </w:rPr>
-              <w:t>Draft Project Management Plan</w:t>
+              <w:t>Draft Project Management Plan &amp; Sprint Schedule</w:t>
             </w:r>
           </w:p>
         </w:tc>
@@ -6440,7 +6440,7 @@
               <w:rPr>
                 <w:sz w:val="16"/>
               </w:rPr>
-              <w:t>MAG-12</w:t>
+              <w:t>MAG-15</w:t>
             </w:r>
           </w:p>
         </w:tc>
@@ -6498,7 +6498,7 @@
               <w:rPr>
                 <w:sz w:val="16"/>
               </w:rPr>
-              <w:t>MAG-13</w:t>
+              <w:t>MAG-16</w:t>
             </w:r>
           </w:p>
         </w:tc>
@@ -6556,7 +6556,7 @@
               <w:rPr>
                 <w:sz w:val="16"/>
               </w:rPr>
-              <w:t>MAG-14</w:t>
+              <w:t>MAG-17</w:t>
             </w:r>
           </w:p>
         </w:tc>
@@ -6614,7 +6614,7 @@
               <w:rPr>
                 <w:sz w:val="16"/>
               </w:rPr>
-              <w:t>MAG-15</w:t>
+              <w:t>MAG-18</w:t>
             </w:r>
           </w:p>
         </w:tc>
@@ -6672,7 +6672,7 @@
               <w:rPr>
                 <w:sz w:val="16"/>
               </w:rPr>
-              <w:t>MAG-16</w:t>
+              <w:t>MAG-19</w:t>
             </w:r>
           </w:p>
         </w:tc>
@@ -6730,7 +6730,7 @@
               <w:rPr>
                 <w:sz w:val="16"/>
               </w:rPr>
-              <w:t>MAG-17</w:t>
+              <w:t>MAG-20</w:t>
             </w:r>
           </w:p>
         </w:tc>
@@ -6788,7 +6788,7 @@
               <w:rPr>
                 <w:sz w:val="16"/>
               </w:rPr>
-              <w:t>MAG-18</w:t>
+              <w:t>MAG-21</w:t>
             </w:r>
           </w:p>
         </w:tc>
@@ -6817,6 +6817,238 @@
                 <w:sz w:val="16"/>
               </w:rPr>
               <w:t>Database</w:t>
+            </w:r>
+          </w:p>
+        </w:tc>
+        <w:tc>
+          <w:tcPr>
+            <w:tcW w:type="dxa" w:w="2340"/>
+          </w:tcPr>
+          <w:p>
+            <w:r/>
+            <w:r>
+              <w:rPr>
+                <w:sz w:val="16"/>
+              </w:rPr>
+              <w:t>Sprint 3</w:t>
+            </w:r>
+          </w:p>
+        </w:tc>
+      </w:tr>
+      <w:tr>
+        <w:tc>
+          <w:tcPr>
+            <w:tcW w:type="dxa" w:w="2340"/>
+          </w:tcPr>
+          <w:p>
+            <w:r/>
+            <w:r>
+              <w:rPr>
+                <w:sz w:val="16"/>
+              </w:rPr>
+              <w:t>MAG-22</w:t>
+            </w:r>
+          </w:p>
+        </w:tc>
+        <w:tc>
+          <w:tcPr>
+            <w:tcW w:type="dxa" w:w="2340"/>
+          </w:tcPr>
+          <w:p>
+            <w:r/>
+            <w:r>
+              <w:rPr>
+                <w:sz w:val="16"/>
+              </w:rPr>
+              <w:t>Budget Tracker Page</w:t>
+            </w:r>
+          </w:p>
+        </w:tc>
+        <w:tc>
+          <w:tcPr>
+            <w:tcW w:type="dxa" w:w="2340"/>
+          </w:tcPr>
+          <w:p>
+            <w:r/>
+            <w:r>
+              <w:rPr>
+                <w:sz w:val="16"/>
+              </w:rPr>
+              <w:t>Frontend</w:t>
+            </w:r>
+          </w:p>
+        </w:tc>
+        <w:tc>
+          <w:tcPr>
+            <w:tcW w:type="dxa" w:w="2340"/>
+          </w:tcPr>
+          <w:p>
+            <w:r/>
+            <w:r>
+              <w:rPr>
+                <w:sz w:val="16"/>
+              </w:rPr>
+              <w:t>Sprint 3</w:t>
+            </w:r>
+          </w:p>
+        </w:tc>
+      </w:tr>
+      <w:tr>
+        <w:tc>
+          <w:tcPr>
+            <w:tcW w:type="dxa" w:w="2340"/>
+          </w:tcPr>
+          <w:p>
+            <w:r/>
+            <w:r>
+              <w:rPr>
+                <w:sz w:val="16"/>
+              </w:rPr>
+              <w:t>MAG-23</w:t>
+            </w:r>
+          </w:p>
+        </w:tc>
+        <w:tc>
+          <w:tcPr>
+            <w:tcW w:type="dxa" w:w="2340"/>
+          </w:tcPr>
+          <w:p>
+            <w:r/>
+            <w:r>
+              <w:rPr>
+                <w:sz w:val="16"/>
+              </w:rPr>
+              <w:t>Authentication &amp; Protected Routes</w:t>
+            </w:r>
+          </w:p>
+        </w:tc>
+        <w:tc>
+          <w:tcPr>
+            <w:tcW w:type="dxa" w:w="2340"/>
+          </w:tcPr>
+          <w:p>
+            <w:r/>
+            <w:r>
+              <w:rPr>
+                <w:sz w:val="16"/>
+              </w:rPr>
+              <w:t>Frontend</w:t>
+            </w:r>
+          </w:p>
+        </w:tc>
+        <w:tc>
+          <w:tcPr>
+            <w:tcW w:type="dxa" w:w="2340"/>
+          </w:tcPr>
+          <w:p>
+            <w:r/>
+            <w:r>
+              <w:rPr>
+                <w:sz w:val="16"/>
+              </w:rPr>
+              <w:t>Sprint 3</w:t>
+            </w:r>
+          </w:p>
+        </w:tc>
+      </w:tr>
+      <w:tr>
+        <w:tc>
+          <w:tcPr>
+            <w:tcW w:type="dxa" w:w="2340"/>
+          </w:tcPr>
+          <w:p>
+            <w:r/>
+            <w:r>
+              <w:rPr>
+                <w:sz w:val="16"/>
+              </w:rPr>
+              <w:t>MAG-24</w:t>
+            </w:r>
+          </w:p>
+        </w:tc>
+        <w:tc>
+          <w:tcPr>
+            <w:tcW w:type="dxa" w:w="2340"/>
+          </w:tcPr>
+          <w:p>
+            <w:r/>
+            <w:r>
+              <w:rPr>
+                <w:sz w:val="16"/>
+              </w:rPr>
+              <w:t>Shared UI Components &amp; Guest Management</w:t>
+            </w:r>
+          </w:p>
+        </w:tc>
+        <w:tc>
+          <w:tcPr>
+            <w:tcW w:type="dxa" w:w="2340"/>
+          </w:tcPr>
+          <w:p>
+            <w:r/>
+            <w:r>
+              <w:rPr>
+                <w:sz w:val="16"/>
+              </w:rPr>
+              <w:t>Frontend</w:t>
+            </w:r>
+          </w:p>
+        </w:tc>
+        <w:tc>
+          <w:tcPr>
+            <w:tcW w:type="dxa" w:w="2340"/>
+          </w:tcPr>
+          <w:p>
+            <w:r/>
+            <w:r>
+              <w:rPr>
+                <w:sz w:val="16"/>
+              </w:rPr>
+              <w:t>Sprint 3</w:t>
+            </w:r>
+          </w:p>
+        </w:tc>
+      </w:tr>
+      <w:tr>
+        <w:tc>
+          <w:tcPr>
+            <w:tcW w:type="dxa" w:w="2340"/>
+          </w:tcPr>
+          <w:p>
+            <w:r/>
+            <w:r>
+              <w:rPr>
+                <w:sz w:val="16"/>
+              </w:rPr>
+              <w:t>MAG-25</w:t>
+            </w:r>
+          </w:p>
+        </w:tc>
+        <w:tc>
+          <w:tcPr>
+            <w:tcW w:type="dxa" w:w="2340"/>
+          </w:tcPr>
+          <w:p>
+            <w:r/>
+            <w:r>
+              <w:rPr>
+                <w:sz w:val="16"/>
+              </w:rPr>
+              <w:t>Vendor Data Model Enrichment</w:t>
+            </w:r>
+          </w:p>
+        </w:tc>
+        <w:tc>
+          <w:tcPr>
+            <w:tcW w:type="dxa" w:w="2340"/>
+          </w:tcPr>
+          <w:p>
+            <w:r/>
+            <w:r>
+              <w:rPr>
+                <w:sz w:val="16"/>
+              </w:rPr>
+              <w:t>Backend &amp; Frontend</w:t>
             </w:r>
           </w:p>
         </w:tc>
@@ -6837,6 +7069,19 @@
       </w:tr>
     </w:tbl>
     <w:p/>
+    <w:p>
+      <w:pPr>
+        <w:ind w:left="567"/>
+      </w:pPr>
+      <w:r>
+        <w:rPr>
+          <w:i/>
+          <w:color w:val="555555"/>
+          <w:sz w:val="20"/>
+        </w:rPr>
+        <w:t>**Note:** MAG-12 through MAG-14 are reserved and not used in the current backlog.</w:t>
+      </w:r>
+    </w:p>
     <w:p>
       <w:r>
         <w:t>────────────────────────────────────────────────────────────</w:t>

</xml_diff>